<commit_message>
Replace contracts with the approved NPD Word template
</commit_message>
<xml_diff>
--- a/docs/templates/services.docx
+++ b/docs/templates/services.docx
@@ -29,7 +29,7 @@
     </w:p>
     <w:p>
       <w:pPr>
-        <w:spacing w:after="200" w:before="0" w:line="240" w:lineRule="auto"/>
+        <w:spacing w:after="0" w:before="0" w:line="240" w:lineRule="auto"/>
         <w:jc w:val="center"/>
         <w:rPr>
           <w:b w:val="1"/>
@@ -150,7 +150,7 @@
     </w:tbl>
     <w:p>
       <w:pPr>
-        <w:spacing w:line="240" w:lineRule="auto"/>
+        <w:spacing w:after="0" w:before="0" w:line="240" w:lineRule="auto"/>
         <w:ind w:firstLine="425.19685039370086"/>
         <w:jc w:val="both"/>
         <w:rPr/>
@@ -161,19 +161,19 @@
           <w:bCs w:val="1"/>
           <w:rtl w:val="0"/>
         </w:rPr>
-        <w:t xml:space="preserve">{{executorPreambleName}}</w:t>
-      </w:r>
-      <w:r>
-        <w:rPr>
-          <w:rtl w:val="0"/>
-        </w:rPr>
-        <w:t xml:space="preserve">{{executorPreambleTail}}</w:t>
+        <w:t xml:space="preserve">Гражданин {{executorName}}, </w:t>
+      </w:r>
+      <w:r>
+        <w:rPr>
+          <w:rtl w:val="0"/>
+        </w:rPr>
+        <w:t xml:space="preserve">зарегистрированный в качестве налогоплательщика налога на профессиональный доход от {{npdDate}} № {{npdNumber}}, именуемый в дальнейшем «Исполнитель», с одной стороны, и </w:t>
       </w:r>
     </w:p>
     <w:p>
       <w:pPr>
         <w:widowControl w:val="1"/>
-        <w:spacing w:after="160" w:before="0" w:line="240" w:lineRule="auto"/>
+        <w:spacing w:after="0" w:before="0" w:line="240" w:lineRule="auto"/>
         <w:ind w:firstLine="425.19685039370086"/>
         <w:jc w:val="both"/>
         <w:rPr/>
@@ -184,18 +184,18 @@
           <w:bCs w:val="1"/>
           <w:rtl w:val="0"/>
         </w:rPr>
-        <w:t xml:space="preserve">{{customerPreambleName}}</w:t>
-      </w:r>
-      <w:r>
-        <w:rPr>
-          <w:rtl w:val="0"/>
-        </w:rPr>
-        <w:t xml:space="preserve">{{customerPreambleTail}}</w:t>
-      </w:r>
-    </w:p>
-    <w:p>
-      <w:pPr>
-        <w:spacing w:after="0" w:line="240" w:lineRule="auto"/>
+        <w:t xml:space="preserve">{{customerTitle}}</w:t>
+      </w:r>
+      <w:r>
+        <w:rPr>
+          <w:rtl w:val="0"/>
+        </w:rPr>
+        <w:t xml:space="preserve">, в лице {{customerSignerGen}}, действующего на основании {{customerBasis}}, именуемый в дальнейшем «Заказчик», с другой стороны, </w:t>
+      </w:r>
+    </w:p>
+    <w:p>
+      <w:pPr>
+        <w:spacing w:after="0" w:before="0" w:line="240" w:lineRule="auto"/>
         <w:ind w:firstLine="708.6614173228347"/>
         <w:jc w:val="both"/>
         <w:rPr/>
@@ -249,7 +249,12 @@
         <w:rPr>
           <w:rtl w:val="0"/>
         </w:rPr>
-        <w:t xml:space="preserve">{{subjectClause}}</w:t>
+        <w:t xml:space="preserve">1.1. Исполнитель обязуется по заданию Заказчика согласно Спецификации (Приложение № 1 к настоящему договору) оказать услугу: {{serviceSubject}}, а Заказчик в случае отсутствия мотивированных возражений обязуется принять и оплатить данную услугу.</w:t>
+      </w:r>
+      <w:r>
+        <w:rPr>
+          <w:rtl w:val="0"/>
+        </w:rPr>
       </w:r>
     </w:p>
     <w:p>
@@ -316,7 +321,7 @@
           <w:bCs w:val="1"/>
           <w:rtl w:val="0"/>
         </w:rPr>
-        <w:t xml:space="preserve">{{executorRole}} обязуется:</w:t>
+        <w:t xml:space="preserve">Исполнитель обязуется:</w:t>
       </w:r>
       <w:r>
         <w:rPr>
@@ -336,7 +341,7 @@
         <w:rPr>
           <w:rtl w:val="0"/>
         </w:rPr>
-        <w:t xml:space="preserve">2.2.1. надлежащим образом {{verbObject}} надлежащего качества, перечисленные в п. 1.1. Договора и в приложениях (спецификациях), являющихся неотъемлемой частью Договора;</w:t>
+        <w:t xml:space="preserve">2.2.1. надлежащим образом оказать Услуги надлежащего качества, перечисленные в п. 1.1. Договора и в приложениях (спецификациях), являющихся неотъемлемой частью Договора;</w:t>
       </w:r>
     </w:p>
     <w:p>
@@ -369,7 +374,7 @@
           <w:bCs w:val="1"/>
           <w:rtl w:val="0"/>
         </w:rPr>
-        <w:t xml:space="preserve">{{executorRole}} имеет право:</w:t>
+        <w:t xml:space="preserve">Исполнитель имеет право:</w:t>
       </w:r>
     </w:p>
     <w:p>
@@ -386,7 +391,7 @@
         <w:rPr>
           <w:rtl w:val="0"/>
         </w:rPr>
-        <w:t xml:space="preserve">2.3.1. требовать и получать от {{customerGen}} все необходимые для исполнения Договора сведения.</w:t>
+        <w:t xml:space="preserve">2.3.1. требовать и получать от Заказчика все необходимые для исполнения Договора сведения.</w:t>
       </w:r>
       <w:r>
         <w:rPr>
@@ -407,7 +412,7 @@
           <w:bCs w:val="1"/>
           <w:rtl w:val="0"/>
         </w:rPr>
-        <w:t xml:space="preserve">2.4. {{customerRole}} обязуется:</w:t>
+        <w:t xml:space="preserve">2.4. Заказчик обязуется:</w:t>
       </w:r>
       <w:r>
         <w:rPr>
@@ -445,7 +450,7 @@
           <w:bCs w:val="1"/>
           <w:rtl w:val="0"/>
         </w:rPr>
-        <w:t xml:space="preserve">2.5. {{customerRole}} имеет право:</w:t>
+        <w:t xml:space="preserve">2.5. Заказчик имеет право:</w:t>
       </w:r>
     </w:p>
     <w:p>
@@ -459,7 +464,7 @@
         <w:rPr>
           <w:rtl w:val="0"/>
         </w:rPr>
-        <w:t xml:space="preserve">2.5.1. во всякое время проверять качество {{objectQuality}} {{executorInstrumental}}, не вмешиваясь в его деятельность.</w:t>
+        <w:t xml:space="preserve">2.5.1. во всякое время проверять качество Услуг, оказываемых Исполнителем, не вмешиваясь в его деятельность.</w:t>
       </w:r>
     </w:p>
     <w:p>
@@ -497,41 +502,6 @@
     <w:p>
       <w:pPr>
         <w:widowControl w:val="1"/>
-        <w:spacing w:after="0" w:before="0" w:line="240" w:lineRule="auto"/>
-        <w:ind w:firstLine="425"/>
-        <w:jc w:val="both"/>
-        <w:rPr>
-          <w:color w:val="ff0000"/>
-        </w:rPr>
-      </w:pPr>
-      <w:r>
-        <w:rPr>
-          <w:rtl w:val="0"/>
-        </w:rPr>
-        <w:t xml:space="preserve">{{priceLead}}</w:t>
-      </w:r>
-      <w:r>
-        <w:rPr>
-          <w:b w:val="1"/>
-          <w:bCs w:val="1"/>
-          <w:rtl w:val="0"/>
-        </w:rPr>
-        <w:t xml:space="preserve">{{amountWithWords}}</w:t>
-      </w:r>
-      <w:r>
-        <w:rPr>
-          <w:rtl w:val="0"/>
-        </w:rPr>
-        <w:t xml:space="preserve"> {{vatLine}}</w:t>
-      </w:r>
-      <w:r>
-        <w:rPr>
-          <w:rtl w:val="0"/>
-        </w:rPr>
-      </w:r>
-    </w:p>
-    <w:p>
-      <w:pPr>
         <w:spacing w:after="0" w:before="0" w:line="240" w:lineRule="auto"/>
         <w:ind w:firstLine="425"/>
         <w:jc w:val="both"/>
@@ -541,7 +511,26 @@
         <w:rPr>
           <w:rtl w:val="0"/>
         </w:rPr>
-        <w:t xml:space="preserve">{{paymentClause}}</w:t>
+        <w:t xml:space="preserve">3.1. Стоимость оказываемых услуг по настоящему договору составляет: </w:t>
+      </w:r>
+      <w:r>
+        <w:rPr>
+          <w:b w:val="1"/>
+          <w:bCs w:val="1"/>
+          <w:rtl w:val="0"/>
+        </w:rPr>
+        <w:t xml:space="preserve">{{amountWithWords}}</w:t>
+      </w:r>
+      <w:r>
+        <w:rPr>
+          <w:rtl w:val="0"/>
+        </w:rPr>
+        <w:t xml:space="preserve"> НДС не облагается в связи с применением Исполнителем специального налогового режима «Налог на профессиональный доход» на основании Федерального закона от 27.11.2018 № 422-ФЗ».</w:t>
+      </w:r>
+      <w:r>
+        <w:rPr>
+          <w:rtl w:val="0"/>
+        </w:rPr>
       </w:r>
     </w:p>
     <w:p>
@@ -555,7 +544,7 @@
         <w:rPr>
           <w:rtl w:val="0"/>
         </w:rPr>
-        <w:t xml:space="preserve">3.3. Договор считается оплаченным с даты поступления всех денежных средств, предусмотренных п. 3.1. Договора, на расчетный счет {{executorGen}}.</w:t>
+        <w:t xml:space="preserve">3.2. Заказчик оплачивает Стоимость по Договору Исполнителю путем перечисления денежных средств на расчетный счет Исполнителя в размере 100% оплаты.</w:t>
       </w:r>
     </w:p>
     <w:p>
@@ -569,37 +558,7 @@
         <w:rPr>
           <w:rtl w:val="0"/>
         </w:rPr>
-        <w:t xml:space="preserve">3.4. В случае несвоевременного исполнения {{customerInstrumental}} обязательств по оплате, {{executorRole}} вправе взыскать с {{customerGen}} проценты за пользование чужими денежными средствами в соответствии со ст. 395 ГК РФ.</w:t>
-      </w:r>
-    </w:p>
-    <w:p>
-      <w:pPr>
-        <w:spacing w:after="0" w:before="0" w:line="240" w:lineRule="auto"/>
-        <w:jc w:val="both"/>
-        <w:rPr/>
-      </w:pPr>
-      <w:r>
-        <w:rPr>
-          <w:rtl w:val="0"/>
-        </w:rPr>
-      </w:r>
-    </w:p>
-    <w:p>
-      <w:pPr>
-        <w:spacing w:after="0" w:before="0" w:line="240" w:lineRule="auto"/>
-        <w:jc w:val="center"/>
-        <w:rPr>
-          <w:b w:val="1"/>
-          <w:bCs w:val="1"/>
-        </w:rPr>
-      </w:pPr>
-      <w:r>
-        <w:rPr>
-          <w:b w:val="1"/>
-          <w:bCs w:val="1"/>
-          <w:rtl w:val="0"/>
-        </w:rPr>
-        <w:t xml:space="preserve">4. ОТВЕТСТВЕННОСТЬ СТОРОН</w:t>
+        <w:t xml:space="preserve">3.3. Договор считается оплаченным с даты поступления всех денежных средств, предусмотренных п. 3.1. Договора, на расчетный счет Исполнителя.</w:t>
       </w:r>
     </w:p>
     <w:p>
@@ -613,7 +572,37 @@
         <w:rPr>
           <w:rtl w:val="0"/>
         </w:rPr>
-        <w:t xml:space="preserve">4.1. В случае неисполнения либо ненадлежащего исполнения принятых на себя обязательств по Договору Сторона, допустившая указанные нарушения, несет ответственность в соответствии с законодательством Российской Федерации.</w:t>
+        <w:t xml:space="preserve">3.4. В случае несвоевременного исполнения Заказчиком обязательств по оплате, Исполнитель вправе взыскать с Заказчика проценты за пользование чужими денежными средствами в соответствии со ст. 395 ГК РФ.</w:t>
+      </w:r>
+    </w:p>
+    <w:p>
+      <w:pPr>
+        <w:spacing w:after="0" w:before="0" w:line="240" w:lineRule="auto"/>
+        <w:jc w:val="both"/>
+        <w:rPr/>
+      </w:pPr>
+      <w:r>
+        <w:rPr>
+          <w:rtl w:val="0"/>
+        </w:rPr>
+      </w:r>
+    </w:p>
+    <w:p>
+      <w:pPr>
+        <w:spacing w:after="0" w:before="0" w:line="240" w:lineRule="auto"/>
+        <w:jc w:val="center"/>
+        <w:rPr>
+          <w:b w:val="1"/>
+          <w:bCs w:val="1"/>
+        </w:rPr>
+      </w:pPr>
+      <w:r>
+        <w:rPr>
+          <w:b w:val="1"/>
+          <w:bCs w:val="1"/>
+          <w:rtl w:val="0"/>
+        </w:rPr>
+        <w:t xml:space="preserve">4. ОТВЕТСТВЕННОСТЬ СТОРОН</w:t>
       </w:r>
     </w:p>
     <w:p>
@@ -627,7 +616,7 @@
         <w:rPr>
           <w:rtl w:val="0"/>
         </w:rPr>
-        <w:t xml:space="preserve">4.2. Ни одна из Сторон не несет ответственности за невыполнение каких-либо своих обязательств по Договору, если такое невыполнение вызвано или возникает в результате форс-мажорных обстоятельств.</w:t>
+        <w:t xml:space="preserve">4.1. Исполнитель обязуется передать сведения о произведенных расчетах в налоговый орган, сформировать чек и обеспечить его передачу Заказчику.</w:t>
       </w:r>
     </w:p>
     <w:p>
@@ -641,14 +630,67 @@
         <w:rPr>
           <w:rtl w:val="0"/>
         </w:rPr>
-        <w:t xml:space="preserve">4.3. При наступлении форс-мажорных обстоятельств, срок исполнения обязательств по Договору изменяется соразмерно времени, в течение которого действовали такие обстоятельства.</w:t>
-      </w:r>
-    </w:p>
-    <w:p>
-      <w:pPr>
-        <w:spacing w:after="0" w:before="0" w:line="240" w:lineRule="auto"/>
+        <w:t xml:space="preserve">4.2. Исполнитель обязуется сформировать и передать Заказчику чек в момент расчета с использованием электронных средств платежа. При иных формах денежных расчетов в безналичном порядке чек должен быть сформирован и передан Заказчику не позднее 9-го числа месяца, следующего за налоговым периодом, в котором произведены расчеты, согласно ч. 3 ст. 14 Федерального закона от 27.11.2018 № 422-ФЗ.</w:t>
+      </w:r>
+    </w:p>
+    <w:p>
+      <w:pPr>
+        <w:spacing w:after="0" w:before="0" w:line="240" w:lineRule="auto"/>
+        <w:ind w:firstLine="425"/>
         <w:jc w:val="both"/>
         <w:rPr/>
+      </w:pPr>
+      <w:r>
+        <w:rPr>
+          <w:rtl w:val="0"/>
+        </w:rPr>
+        <w:t xml:space="preserve">4.3. В случае неисполнения либо ненадлежащего исполнения принятых на себя обязательств по Договору Сторона, допустившая указанные нарушения, несет ответственность в соответствии с законодательством Российской Федерации.</w:t>
+      </w:r>
+    </w:p>
+    <w:p>
+      <w:pPr>
+        <w:spacing w:after="0" w:before="0" w:line="240" w:lineRule="auto"/>
+        <w:ind w:firstLine="425"/>
+        <w:jc w:val="both"/>
+        <w:rPr/>
+      </w:pPr>
+      <w:r>
+        <w:rPr>
+          <w:rtl w:val="0"/>
+        </w:rPr>
+        <w:t xml:space="preserve">4.4. Ни одна из Сторон не несет ответственности за невыполнение каких-либо своих обязательств по Договору, если такое невыполнение вызвано или возникает в результате форс-мажорных обстоятельств.</w:t>
+      </w:r>
+    </w:p>
+    <w:p>
+      <w:pPr>
+        <w:spacing w:after="0" w:before="0" w:line="240" w:lineRule="auto"/>
+        <w:ind w:firstLine="425"/>
+        <w:jc w:val="both"/>
+        <w:rPr>
+          <w:b w:val="1"/>
+          <w:bCs w:val="1"/>
+        </w:rPr>
+      </w:pPr>
+      <w:r>
+        <w:rPr>
+          <w:rtl w:val="0"/>
+        </w:rPr>
+        <w:t xml:space="preserve">4.5. При наступлении форс-мажорных обстоятельств, срок исполнения обязательств по Договору изменяется соразмерно времени, в течение которого действовали такие обстоятельства.</w:t>
+      </w:r>
+      <w:r>
+        <w:rPr>
+          <w:rtl w:val="0"/>
+        </w:rPr>
+      </w:r>
+    </w:p>
+    <w:p>
+      <w:pPr>
+        <w:spacing w:after="0" w:before="0" w:line="240" w:lineRule="auto"/>
+        <w:jc w:val="both"/>
+        <w:rPr>
+          <w:b w:val="1"/>
+          <w:bCs w:val="1"/>
+        </w:rPr>
       </w:pPr>
       <w:r>
         <w:rPr>
@@ -864,13 +906,23 @@
       <w:tr>
         <w:trPr>
           <w:cantSplit w:val="0"/>
-          <w:trHeight w:val="185.9765625" w:hRule="atLeast"/>
           <w:tblHeader w:val="0"/>
         </w:trPr>
         <w:tc>
           <w:tcPr>
             <w:gridSpan w:val="2"/>
-            <w:vAlign w:val="center"/>
+            <w:tcBorders>
+              <w:top w:color="000000" w:space="0" w:sz="0" w:val="nil"/>
+              <w:left w:color="000000" w:space="0" w:sz="0" w:val="nil"/>
+              <w:bottom w:color="000000" w:space="0" w:sz="0" w:val="nil"/>
+              <w:right w:color="000000" w:space="0" w:sz="0" w:val="nil"/>
+            </w:tcBorders>
+            <w:tcMar>
+              <w:top w:w="99.77952755905513" w:type="dxa"/>
+              <w:left w:w="99.77952755905513" w:type="dxa"/>
+              <w:bottom w:w="99.77952755905513" w:type="dxa"/>
+              <w:right w:w="99.77952755905513" w:type="dxa"/>
+            </w:tcMar>
           </w:tcPr>
           <w:p>
             <w:pPr>
@@ -894,15 +946,9 @@
                 <w:bCs w:val="1"/>
                 <w:rtl w:val="0"/>
               </w:rPr>
-              <w:t xml:space="preserve">{{customerRole}}</w:t>
-            </w:r>
-          </w:p>
-        </w:tc>
-        <w:tc>
-          <w:tcPr>
-            <w:gridSpan w:val="2"/>
-            <w:vAlign w:val="center"/>
-          </w:tcPr>
+              <w:t xml:space="preserve">Заказчик:</w:t>
+            </w:r>
+          </w:p>
           <w:p>
             <w:pPr>
               <w:pBdr>
@@ -925,20 +971,22 @@
                 <w:bCs w:val="1"/>
                 <w:rtl w:val="0"/>
               </w:rPr>
-              <w:t xml:space="preserve">{{executorRole}}</w:t>
-            </w:r>
-          </w:p>
-        </w:tc>
-      </w:tr>
-      <w:tr>
-        <w:trPr>
-          <w:cantSplit w:val="0"/>
-          <w:tblHeader w:val="0"/>
-        </w:trPr>
+              <w:t xml:space="preserve">{{customerShortTitle}} </w:t>
+            </w:r>
+          </w:p>
+        </w:tc>
         <w:tc>
           <w:tcPr>
             <w:gridSpan w:val="2"/>
-            <w:vAlign w:val="center"/>
+            <w:tcBorders>
+              <w:left w:color="000000" w:space="0" w:sz="0" w:val="nil"/>
+            </w:tcBorders>
+            <w:tcMar>
+              <w:top w:w="99.77952755905513" w:type="dxa"/>
+              <w:left w:w="99.77952755905513" w:type="dxa"/>
+              <w:bottom w:w="99.77952755905513" w:type="dxa"/>
+              <w:right w:w="99.77952755905513" w:type="dxa"/>
+            </w:tcMar>
           </w:tcPr>
           <w:p>
             <w:pPr>
@@ -962,44 +1010,9 @@
                 <w:bCs w:val="1"/>
                 <w:rtl w:val="0"/>
               </w:rPr>
-              <w:t xml:space="preserve">{{customerShortTitle}}</w:t>
-            </w:r>
-          </w:p>
-        </w:tc>
-        <w:tc>
-          <w:tcPr>
-            <w:gridSpan w:val="2"/>
-            <w:vAlign w:val="center"/>
-          </w:tcPr>
-          <w:p>
-            <w:pPr>
-              <w:spacing w:after="0" w:before="0" w:lineRule="auto"/>
-              <w:jc w:val="center"/>
-              <w:rPr>
-                <w:b w:val="1"/>
-                <w:bCs w:val="1"/>
-              </w:rPr>
-            </w:pPr>
-            <w:r>
-              <w:rPr>
-                <w:b w:val="1"/>
-                <w:bCs w:val="1"/>
-                <w:rtl w:val="0"/>
-              </w:rPr>
-              <w:t xml:space="preserve">{{executorShortTitle}}</w:t>
-            </w:r>
-          </w:p>
-        </w:tc>
-      </w:tr>
-      <w:tr>
-        <w:trPr>
-          <w:cantSplit w:val="0"/>
-          <w:tblHeader w:val="0"/>
-        </w:trPr>
-        <w:tc>
-          <w:tcPr>
-            <w:vAlign w:val="center"/>
-          </w:tcPr>
+              <w:t xml:space="preserve">Исполнитель:</w:t>
+            </w:r>
+          </w:p>
           <w:p>
             <w:pPr>
               <w:pBdr>
@@ -1018,19 +1031,286 @@
             </w:pPr>
             <w:r>
               <w:rPr>
-                <w:rtl w:val="0"/>
-              </w:rPr>
-              <w:t xml:space="preserve">{{customerRegistrationLabel}}</w:t>
-            </w:r>
-            <w:r>
-              <w:rPr>
-                <w:rtl w:val="0"/>
-              </w:rPr>
-            </w:r>
-          </w:p>
-        </w:tc>
-        <w:tc>
-          <w:tcPr>
+                <w:b w:val="1"/>
+                <w:bCs w:val="1"/>
+                <w:rtl w:val="0"/>
+              </w:rPr>
+              <w:t xml:space="preserve">Самозанятый {{executorName}}</w:t>
+            </w:r>
+          </w:p>
+        </w:tc>
+      </w:tr>
+      <w:tr>
+        <w:trPr>
+          <w:cantSplit w:val="0"/>
+          <w:trHeight w:val="221.953125" w:hRule="atLeast"/>
+          <w:tblHeader w:val="0"/>
+        </w:trPr>
+        <w:tc>
+          <w:tcPr>
+            <w:tcBorders>
+              <w:top w:color="000000" w:space="0" w:sz="0" w:val="nil"/>
+              <w:left w:color="000000" w:space="0" w:sz="0" w:val="nil"/>
+              <w:bottom w:color="000000" w:space="0" w:sz="0" w:val="nil"/>
+              <w:right w:color="000000" w:space="0" w:sz="0" w:val="nil"/>
+            </w:tcBorders>
+            <w:tcMar>
+              <w:top w:w="99.77952755905513" w:type="dxa"/>
+              <w:left w:w="99.77952755905513" w:type="dxa"/>
+              <w:bottom w:w="99.77952755905513" w:type="dxa"/>
+              <w:right w:w="99.77952755905513" w:type="dxa"/>
+            </w:tcMar>
+            <w:vAlign w:val="center"/>
+          </w:tcPr>
+          <w:p>
+            <w:pPr>
+              <w:pBdr>
+                <w:top w:color="000000" w:space="0" w:sz="0" w:val="none"/>
+                <w:left w:color="000000" w:space="0" w:sz="0" w:val="none"/>
+                <w:bottom w:color="000000" w:space="0" w:sz="0" w:val="none"/>
+                <w:right w:color="000000" w:space="0" w:sz="0" w:val="none"/>
+                <w:between w:color="000000" w:space="0" w:sz="0" w:val="none"/>
+              </w:pBdr>
+              <w:spacing w:after="0" w:before="0" w:line="240" w:lineRule="auto"/>
+              <w:jc w:val="left"/>
+              <w:rPr>
+                <w:b w:val="1"/>
+                <w:bCs w:val="1"/>
+              </w:rPr>
+            </w:pPr>
+            <w:r>
+              <w:rPr>
+                <w:rtl w:val="0"/>
+              </w:rPr>
+              <w:t xml:space="preserve">ОГРН</w:t>
+            </w:r>
+            <w:r>
+              <w:rPr>
+                <w:rtl w:val="0"/>
+              </w:rPr>
+            </w:r>
+          </w:p>
+        </w:tc>
+        <w:tc>
+          <w:tcPr>
+            <w:tcBorders>
+              <w:top w:color="000000" w:space="0" w:sz="0" w:val="nil"/>
+              <w:left w:color="000000" w:space="0" w:sz="0" w:val="nil"/>
+            </w:tcBorders>
+            <w:shd w:fill="auto" w:val="clear"/>
+            <w:tcMar>
+              <w:top w:w="99.77952755905513" w:type="dxa"/>
+              <w:left w:w="99.77952755905513" w:type="dxa"/>
+              <w:bottom w:w="99.77952755905513" w:type="dxa"/>
+              <w:right w:w="99.77952755905513" w:type="dxa"/>
+            </w:tcMar>
+            <w:vAlign w:val="center"/>
+          </w:tcPr>
+          <w:p>
+            <w:pPr>
+              <w:spacing w:after="0" w:before="0" w:line="240" w:lineRule="auto"/>
+              <w:jc w:val="both"/>
+              <w:rPr/>
+            </w:pPr>
+            <w:r>
+              <w:rPr>
+                <w:rtl w:val="0"/>
+              </w:rPr>
+              <w:t xml:space="preserve">{{customerRegistration}}</w:t>
+            </w:r>
+          </w:p>
+        </w:tc>
+        <w:tc>
+          <w:tcPr>
+            <w:tcMar>
+              <w:top w:w="99.77952755905513" w:type="dxa"/>
+              <w:left w:w="99.77952755905513" w:type="dxa"/>
+              <w:bottom w:w="99.77952755905513" w:type="dxa"/>
+              <w:right w:w="99.77952755905513" w:type="dxa"/>
+            </w:tcMar>
+            <w:vAlign w:val="center"/>
+          </w:tcPr>
+          <w:p>
+            <w:pPr>
+              <w:pBdr>
+                <w:top w:color="000000" w:space="0" w:sz="0" w:val="none"/>
+                <w:left w:color="000000" w:space="0" w:sz="0" w:val="none"/>
+                <w:bottom w:color="000000" w:space="0" w:sz="0" w:val="none"/>
+                <w:right w:color="000000" w:space="0" w:sz="0" w:val="none"/>
+                <w:between w:color="000000" w:space="0" w:sz="0" w:val="none"/>
+              </w:pBdr>
+              <w:spacing w:after="0" w:before="0" w:line="240" w:lineRule="auto"/>
+              <w:jc w:val="center"/>
+              <w:rPr>
+                <w:b w:val="1"/>
+                <w:bCs w:val="1"/>
+              </w:rPr>
+            </w:pPr>
+            <w:r>
+              <w:rPr>
+                <w:rtl w:val="0"/>
+              </w:rPr>
+              <w:t xml:space="preserve">Паспорт</w:t>
+            </w:r>
+            <w:r>
+              <w:rPr>
+                <w:rtl w:val="0"/>
+              </w:rPr>
+            </w:r>
+          </w:p>
+        </w:tc>
+        <w:tc>
+          <w:tcPr>
+            <w:shd w:fill="auto" w:val="clear"/>
+            <w:tcMar>
+              <w:top w:w="99.77952755905513" w:type="dxa"/>
+              <w:left w:w="99.77952755905513" w:type="dxa"/>
+              <w:bottom w:w="99.77952755905513" w:type="dxa"/>
+              <w:right w:w="99.77952755905513" w:type="dxa"/>
+            </w:tcMar>
+            <w:vAlign w:val="center"/>
+          </w:tcPr>
+          <w:p>
+            <w:pPr>
+              <w:spacing w:after="0" w:before="0" w:line="240" w:lineRule="auto"/>
+              <w:rPr/>
+            </w:pPr>
+            <w:r>
+              <w:rPr>
+                <w:rtl w:val="0"/>
+              </w:rPr>
+              <w:t xml:space="preserve">{{executorRegistration}}</w:t>
+            </w:r>
+          </w:p>
+        </w:tc>
+      </w:tr>
+      <w:tr>
+        <w:trPr>
+          <w:cantSplit w:val="0"/>
+          <w:tblHeader w:val="0"/>
+        </w:trPr>
+        <w:tc>
+          <w:tcPr>
+            <w:tcBorders>
+              <w:top w:color="000000" w:space="0" w:sz="0" w:val="nil"/>
+              <w:left w:color="000000" w:space="0" w:sz="0" w:val="nil"/>
+              <w:bottom w:color="000000" w:space="0" w:sz="0" w:val="nil"/>
+              <w:right w:color="000000" w:space="0" w:sz="0" w:val="nil"/>
+            </w:tcBorders>
+            <w:tcMar>
+              <w:top w:w="99.77952755905513" w:type="dxa"/>
+              <w:left w:w="99.77952755905513" w:type="dxa"/>
+              <w:bottom w:w="99.77952755905513" w:type="dxa"/>
+              <w:right w:w="99.77952755905513" w:type="dxa"/>
+            </w:tcMar>
+            <w:vAlign w:val="center"/>
+          </w:tcPr>
+          <w:p>
+            <w:pPr>
+              <w:pBdr>
+                <w:top w:color="000000" w:space="0" w:sz="0" w:val="none"/>
+                <w:left w:color="000000" w:space="0" w:sz="0" w:val="none"/>
+                <w:bottom w:color="000000" w:space="0" w:sz="0" w:val="none"/>
+                <w:right w:color="000000" w:space="0" w:sz="0" w:val="none"/>
+                <w:between w:color="000000" w:space="0" w:sz="0" w:val="none"/>
+              </w:pBdr>
+              <w:spacing w:after="0" w:before="0" w:line="240" w:lineRule="auto"/>
+              <w:jc w:val="center"/>
+              <w:rPr>
+                <w:b w:val="1"/>
+                <w:bCs w:val="1"/>
+              </w:rPr>
+            </w:pPr>
+            <w:r>
+              <w:rPr>
+                <w:rtl w:val="0"/>
+              </w:rPr>
+              <w:t xml:space="preserve">Адрес</w:t>
+            </w:r>
+            <w:r>
+              <w:rPr>
+                <w:rtl w:val="0"/>
+              </w:rPr>
+            </w:r>
+          </w:p>
+        </w:tc>
+        <w:tc>
+          <w:tcPr>
+            <w:tcBorders>
+              <w:left w:color="000000" w:space="0" w:sz="0" w:val="nil"/>
+              <w:bottom w:color="000000" w:space="0" w:sz="0" w:val="nil"/>
+            </w:tcBorders>
+            <w:shd w:fill="auto" w:val="clear"/>
+            <w:tcMar>
+              <w:top w:w="99.77952755905513" w:type="dxa"/>
+              <w:left w:w="99.77952755905513" w:type="dxa"/>
+              <w:bottom w:w="99.77952755905513" w:type="dxa"/>
+              <w:right w:w="99.77952755905513" w:type="dxa"/>
+            </w:tcMar>
+            <w:vAlign w:val="top"/>
+          </w:tcPr>
+          <w:p>
+            <w:pPr>
+              <w:spacing w:after="0" w:before="0" w:line="240" w:lineRule="auto"/>
+              <w:jc w:val="both"/>
+              <w:rPr/>
+            </w:pPr>
+            <w:r>
+              <w:rPr>
+                <w:rtl w:val="0"/>
+              </w:rPr>
+              <w:t xml:space="preserve">{{customerAddress}}</w:t>
+            </w:r>
+          </w:p>
+        </w:tc>
+        <w:tc>
+          <w:tcPr>
+            <w:tcMar>
+              <w:top w:w="99.77952755905513" w:type="dxa"/>
+              <w:left w:w="99.77952755905513" w:type="dxa"/>
+              <w:bottom w:w="99.77952755905513" w:type="dxa"/>
+              <w:right w:w="99.77952755905513" w:type="dxa"/>
+            </w:tcMar>
+            <w:vAlign w:val="center"/>
+          </w:tcPr>
+          <w:p>
+            <w:pPr>
+              <w:pBdr>
+                <w:top w:color="000000" w:space="0" w:sz="0" w:val="none"/>
+                <w:left w:color="000000" w:space="0" w:sz="0" w:val="none"/>
+                <w:bottom w:color="000000" w:space="0" w:sz="0" w:val="none"/>
+                <w:right w:color="000000" w:space="0" w:sz="0" w:val="none"/>
+                <w:between w:color="000000" w:space="0" w:sz="0" w:val="none"/>
+              </w:pBdr>
+              <w:spacing w:after="0" w:before="0" w:line="240" w:lineRule="auto"/>
+              <w:jc w:val="center"/>
+              <w:rPr>
+                <w:b w:val="1"/>
+                <w:bCs w:val="1"/>
+              </w:rPr>
+            </w:pPr>
+            <w:r>
+              <w:rPr>
+                <w:rtl w:val="0"/>
+              </w:rPr>
+              <w:t xml:space="preserve">Адрес</w:t>
+            </w:r>
+            <w:r>
+              <w:rPr>
+                <w:rtl w:val="0"/>
+              </w:rPr>
+            </w:r>
+          </w:p>
+        </w:tc>
+        <w:tc>
+          <w:tcPr>
+            <w:shd w:fill="auto" w:val="clear"/>
+            <w:tcMar>
+              <w:top w:w="99.77952755905513" w:type="dxa"/>
+              <w:left w:w="99.77952755905513" w:type="dxa"/>
+              <w:bottom w:w="99.77952755905513" w:type="dxa"/>
+              <w:right w:w="99.77952755905513" w:type="dxa"/>
+            </w:tcMar>
             <w:vAlign w:val="center"/>
           </w:tcPr>
           <w:p>
@@ -1050,43 +1330,17 @@
               <w:rPr>
                 <w:rtl w:val="0"/>
               </w:rPr>
-              <w:t xml:space="preserve">{{customerRegistration}}</w:t>
-            </w:r>
-          </w:p>
-        </w:tc>
-        <w:tc>
-          <w:tcPr>
-            <w:vAlign w:val="center"/>
-          </w:tcPr>
-          <w:p>
-            <w:pPr>
-              <w:pBdr>
-                <w:top w:color="000000" w:space="0" w:sz="0" w:val="none"/>
-                <w:left w:color="000000" w:space="0" w:sz="0" w:val="none"/>
-                <w:bottom w:color="000000" w:space="0" w:sz="0" w:val="none"/>
-                <w:right w:color="000000" w:space="0" w:sz="0" w:val="none"/>
-                <w:between w:color="000000" w:space="0" w:sz="0" w:val="none"/>
-              </w:pBdr>
-              <w:spacing w:after="0" w:before="0" w:line="240" w:lineRule="auto"/>
-              <w:jc w:val="center"/>
-              <w:rPr>
-                <w:b w:val="1"/>
-                <w:bCs w:val="1"/>
-              </w:rPr>
-            </w:pPr>
-            <w:r>
-              <w:rPr>
-                <w:rtl w:val="0"/>
-              </w:rPr>
-              <w:t xml:space="preserve">{{executorRegistrationLabel}}</w:t>
-            </w:r>
-            <w:r>
-              <w:rPr>
-                <w:rtl w:val="0"/>
-              </w:rPr>
-            </w:r>
-          </w:p>
-        </w:tc>
+              <w:t xml:space="preserve">{{executorAddress}}</w:t>
+            </w:r>
+          </w:p>
+        </w:tc>
+      </w:tr>
+      <w:tr>
+        <w:trPr>
+          <w:cantSplit w:val="0"/>
+          <w:trHeight w:val="95.9765625" w:hRule="atLeast"/>
+          <w:tblHeader w:val="0"/>
+        </w:trPr>
         <w:tc>
           <w:tcPr>
             <w:tcBorders>
@@ -1095,70 +1349,12 @@
               <w:bottom w:color="000000" w:space="0" w:sz="0" w:val="nil"/>
               <w:right w:color="000000" w:space="0" w:sz="0" w:val="nil"/>
             </w:tcBorders>
-            <w:shd w:fill="auto" w:val="clear"/>
-            <w:tcMar>
-              <w:top w:w="100.0" w:type="dxa"/>
-              <w:left w:w="100.0" w:type="dxa"/>
-              <w:bottom w:w="100.0" w:type="dxa"/>
-              <w:right w:w="100.0" w:type="dxa"/>
-            </w:tcMar>
-            <w:vAlign w:val="center"/>
-          </w:tcPr>
-          <w:p>
-            <w:pPr>
-              <w:spacing w:after="0" w:before="0" w:lineRule="auto"/>
-              <w:rPr/>
-            </w:pPr>
-            <w:r>
-              <w:rPr>
-                <w:rtl w:val="0"/>
-              </w:rPr>
-              <w:t xml:space="preserve">{{executorRegistration}}</w:t>
-            </w:r>
-          </w:p>
-        </w:tc>
-      </w:tr>
-      <w:tr>
-        <w:trPr>
-          <w:cantSplit w:val="0"/>
-          <w:trHeight w:val="746.953125" w:hRule="atLeast"/>
-          <w:tblHeader w:val="0"/>
-        </w:trPr>
-        <w:tc>
-          <w:tcPr>
-            <w:vAlign w:val="center"/>
-          </w:tcPr>
-          <w:p>
-            <w:pPr>
-              <w:pBdr>
-                <w:top w:color="000000" w:space="0" w:sz="0" w:val="none"/>
-                <w:left w:color="000000" w:space="0" w:sz="0" w:val="none"/>
-                <w:bottom w:color="000000" w:space="0" w:sz="0" w:val="none"/>
-                <w:right w:color="000000" w:space="0" w:sz="0" w:val="none"/>
-                <w:between w:color="000000" w:space="0" w:sz="0" w:val="none"/>
-              </w:pBdr>
-              <w:spacing w:after="0" w:before="0" w:line="240" w:lineRule="auto"/>
-              <w:jc w:val="center"/>
-              <w:rPr>
-                <w:b w:val="1"/>
-                <w:bCs w:val="1"/>
-              </w:rPr>
-            </w:pPr>
-            <w:r>
-              <w:rPr>
-                <w:rtl w:val="0"/>
-              </w:rPr>
-              <w:t xml:space="preserve">{{customerAddressLabel}}</w:t>
-            </w:r>
-            <w:r>
-              <w:rPr>
-                <w:rtl w:val="0"/>
-              </w:rPr>
-            </w:r>
-          </w:p>
-        </w:tc>
-        <w:tc>
-          <w:tcPr>
+            <w:tcMar>
+              <w:top w:w="99.77952755905513" w:type="dxa"/>
+              <w:left w:w="99.77952755905513" w:type="dxa"/>
+              <w:bottom w:w="99.77952755905513" w:type="dxa"/>
+              <w:right w:w="99.77952755905513" w:type="dxa"/>
+            </w:tcMar>
             <w:vAlign w:val="center"/>
           </w:tcPr>
           <w:p>
@@ -1172,46 +1368,14 @@
                 <w:between w:color="000000" w:space="0" w:sz="0" w:val="none"/>
               </w:pBdr>
               <w:spacing w:after="0" w:before="0" w:line="240" w:lineRule="auto"/>
+              <w:jc w:val="center"/>
               <w:rPr/>
             </w:pPr>
             <w:r>
               <w:rPr>
                 <w:rtl w:val="0"/>
               </w:rPr>
-              <w:t xml:space="preserve">{{customerAddress}}</w:t>
-            </w:r>
-          </w:p>
-        </w:tc>
-        <w:tc>
-          <w:tcPr>
-            <w:vAlign w:val="center"/>
-          </w:tcPr>
-          <w:p>
-            <w:pPr>
-              <w:pBdr>
-                <w:top w:color="000000" w:space="0" w:sz="0" w:val="none"/>
-                <w:left w:color="000000" w:space="0" w:sz="0" w:val="none"/>
-                <w:bottom w:color="000000" w:space="0" w:sz="0" w:val="none"/>
-                <w:right w:color="000000" w:space="0" w:sz="0" w:val="none"/>
-                <w:between w:color="000000" w:space="0" w:sz="0" w:val="none"/>
-              </w:pBdr>
-              <w:spacing w:after="0" w:before="0" w:line="240" w:lineRule="auto"/>
-              <w:jc w:val="center"/>
-              <w:rPr>
-                <w:b w:val="1"/>
-                <w:bCs w:val="1"/>
-              </w:rPr>
-            </w:pPr>
-            <w:r>
-              <w:rPr>
-                <w:rtl w:val="0"/>
-              </w:rPr>
-              <w:t xml:space="preserve">{{executorAddressLabel}}</w:t>
-            </w:r>
-            <w:r>
-              <w:rPr>
-                <w:rtl w:val="0"/>
-              </w:rPr>
+              <w:t xml:space="preserve">ИНН / КПП</w:t>
             </w:r>
           </w:p>
         </w:tc>
@@ -1223,12 +1387,11 @@
               <w:bottom w:color="000000" w:space="0" w:sz="0" w:val="nil"/>
               <w:right w:color="000000" w:space="0" w:sz="0" w:val="nil"/>
             </w:tcBorders>
-            <w:shd w:fill="auto" w:val="clear"/>
-            <w:tcMar>
-              <w:top w:w="100.0" w:type="dxa"/>
-              <w:left w:w="100.0" w:type="dxa"/>
-              <w:bottom w:w="100.0" w:type="dxa"/>
-              <w:right w:w="100.0" w:type="dxa"/>
+            <w:tcMar>
+              <w:top w:w="99.77952755905513" w:type="dxa"/>
+              <w:left w:w="99.77952755905513" w:type="dxa"/>
+              <w:bottom w:w="99.77952755905513" w:type="dxa"/>
+              <w:right w:w="99.77952755905513" w:type="dxa"/>
             </w:tcMar>
             <w:vAlign w:val="center"/>
           </w:tcPr>
@@ -1242,26 +1405,28 @@
                 <w:right w:color="000000" w:space="0" w:sz="0" w:val="none"/>
                 <w:between w:color="000000" w:space="0" w:sz="0" w:val="none"/>
               </w:pBdr>
-              <w:spacing w:after="0" w:before="0" w:lineRule="auto"/>
+              <w:spacing w:after="0" w:before="0" w:line="240" w:lineRule="auto"/>
               <w:rPr/>
             </w:pPr>
             <w:r>
               <w:rPr>
                 <w:rtl w:val="0"/>
               </w:rPr>
-              <w:t xml:space="preserve">{{executorAddress}}</w:t>
-            </w:r>
-          </w:p>
-        </w:tc>
-      </w:tr>
-      <w:tr>
-        <w:trPr>
-          <w:cantSplit w:val="0"/>
-          <w:trHeight w:val="476.40950620962775" w:hRule="atLeast"/>
-          <w:tblHeader w:val="0"/>
-        </w:trPr>
-        <w:tc>
-          <w:tcPr>
+              <w:t xml:space="preserve">{{customerTax}}</w:t>
+            </w:r>
+          </w:p>
+        </w:tc>
+        <w:tc>
+          <w:tcPr>
+            <w:tcBorders>
+              <w:left w:color="000000" w:space="0" w:sz="0" w:val="nil"/>
+            </w:tcBorders>
+            <w:tcMar>
+              <w:top w:w="99.77952755905513" w:type="dxa"/>
+              <w:left w:w="99.77952755905513" w:type="dxa"/>
+              <w:bottom w:w="99.77952755905513" w:type="dxa"/>
+              <w:right w:w="99.77952755905513" w:type="dxa"/>
+            </w:tcMar>
             <w:vAlign w:val="center"/>
           </w:tcPr>
           <w:p>
@@ -1282,12 +1447,19 @@
               <w:rPr>
                 <w:rtl w:val="0"/>
               </w:rPr>
-              <w:t xml:space="preserve">{{customerTaxLabel}}</w:t>
-            </w:r>
-          </w:p>
-        </w:tc>
-        <w:tc>
-          <w:tcPr>
+              <w:t xml:space="preserve">ИНН</w:t>
+            </w:r>
+          </w:p>
+        </w:tc>
+        <w:tc>
+          <w:tcPr>
+            <w:shd w:fill="auto" w:val="clear"/>
+            <w:tcMar>
+              <w:top w:w="99.77952755905513" w:type="dxa"/>
+              <w:left w:w="99.77952755905513" w:type="dxa"/>
+              <w:bottom w:w="99.77952755905513" w:type="dxa"/>
+              <w:right w:w="99.77952755905513" w:type="dxa"/>
+            </w:tcMar>
             <w:vAlign w:val="center"/>
           </w:tcPr>
           <w:p>
@@ -1307,12 +1479,30 @@
               <w:rPr>
                 <w:rtl w:val="0"/>
               </w:rPr>
-              <w:t xml:space="preserve">{{customerTax}}</w:t>
-            </w:r>
-          </w:p>
-        </w:tc>
-        <w:tc>
-          <w:tcPr>
+              <w:t xml:space="preserve">{{executorTax}}</w:t>
+            </w:r>
+          </w:p>
+        </w:tc>
+      </w:tr>
+      <w:tr>
+        <w:trPr>
+          <w:cantSplit w:val="0"/>
+          <w:tblHeader w:val="0"/>
+        </w:trPr>
+        <w:tc>
+          <w:tcPr>
+            <w:tcBorders>
+              <w:top w:color="000000" w:space="0" w:sz="0" w:val="nil"/>
+              <w:left w:color="000000" w:space="0" w:sz="0" w:val="nil"/>
+              <w:bottom w:color="000000" w:space="0" w:sz="0" w:val="nil"/>
+              <w:right w:color="000000" w:space="0" w:sz="0" w:val="nil"/>
+            </w:tcBorders>
+            <w:tcMar>
+              <w:top w:w="99.77952755905513" w:type="dxa"/>
+              <w:left w:w="99.77952755905513" w:type="dxa"/>
+              <w:bottom w:w="99.77952755905513" w:type="dxa"/>
+              <w:right w:w="99.77952755905513" w:type="dxa"/>
+            </w:tcMar>
             <w:vAlign w:val="center"/>
           </w:tcPr>
           <w:p>
@@ -1333,7 +1523,7 @@
               <w:rPr>
                 <w:rtl w:val="0"/>
               </w:rPr>
-              <w:t xml:space="preserve">{{executorTaxLabel}}</w:t>
+              <w:t xml:space="preserve">Р/с</w:t>
             </w:r>
           </w:p>
         </w:tc>
@@ -1345,12 +1535,38 @@
               <w:bottom w:color="000000" w:space="0" w:sz="0" w:val="nil"/>
               <w:right w:color="000000" w:space="0" w:sz="0" w:val="nil"/>
             </w:tcBorders>
-            <w:shd w:fill="auto" w:val="clear"/>
-            <w:tcMar>
-              <w:top w:w="100.0" w:type="dxa"/>
-              <w:left w:w="100.0" w:type="dxa"/>
-              <w:bottom w:w="100.0" w:type="dxa"/>
-              <w:right w:w="100.0" w:type="dxa"/>
+            <w:tcMar>
+              <w:top w:w="99.77952755905513" w:type="dxa"/>
+              <w:left w:w="99.77952755905513" w:type="dxa"/>
+              <w:bottom w:w="99.77952755905513" w:type="dxa"/>
+              <w:right w:w="99.77952755905513" w:type="dxa"/>
+            </w:tcMar>
+            <w:vAlign w:val="center"/>
+          </w:tcPr>
+          <w:p>
+            <w:pPr>
+              <w:spacing w:after="0" w:before="0" w:line="240" w:lineRule="auto"/>
+              <w:jc w:val="both"/>
+              <w:rPr/>
+            </w:pPr>
+            <w:r>
+              <w:rPr>
+                <w:rtl w:val="0"/>
+              </w:rPr>
+              <w:t xml:space="preserve">{{customerAccount}}</w:t>
+            </w:r>
+          </w:p>
+        </w:tc>
+        <w:tc>
+          <w:tcPr>
+            <w:tcBorders>
+              <w:left w:color="000000" w:space="0" w:sz="0" w:val="nil"/>
+            </w:tcBorders>
+            <w:tcMar>
+              <w:top w:w="99.77952755905513" w:type="dxa"/>
+              <w:left w:w="99.77952755905513" w:type="dxa"/>
+              <w:bottom w:w="99.77952755905513" w:type="dxa"/>
+              <w:right w:w="99.77952755905513" w:type="dxa"/>
             </w:tcMar>
             <w:vAlign w:val="center"/>
           </w:tcPr>
@@ -1364,25 +1580,27 @@
                 <w:right w:color="000000" w:space="0" w:sz="0" w:val="none"/>
                 <w:between w:color="000000" w:space="0" w:sz="0" w:val="none"/>
               </w:pBdr>
-              <w:spacing w:after="0" w:before="0" w:lineRule="auto"/>
+              <w:spacing w:after="0" w:before="0" w:line="240" w:lineRule="auto"/>
+              <w:jc w:val="center"/>
               <w:rPr/>
             </w:pPr>
             <w:r>
               <w:rPr>
                 <w:rtl w:val="0"/>
               </w:rPr>
-              <w:t xml:space="preserve">{{executorTax}}</w:t>
-            </w:r>
-          </w:p>
-        </w:tc>
-      </w:tr>
-      <w:tr>
-        <w:trPr>
-          <w:cantSplit w:val="0"/>
-          <w:tblHeader w:val="0"/>
-        </w:trPr>
-        <w:tc>
-          <w:tcPr>
+              <w:t xml:space="preserve">Р/с</w:t>
+            </w:r>
+          </w:p>
+        </w:tc>
+        <w:tc>
+          <w:tcPr>
+            <w:shd w:fill="auto" w:val="clear"/>
+            <w:tcMar>
+              <w:top w:w="99.77952755905513" w:type="dxa"/>
+              <w:left w:w="99.77952755905513" w:type="dxa"/>
+              <w:bottom w:w="99.77952755905513" w:type="dxa"/>
+              <w:right w:w="99.77952755905513" w:type="dxa"/>
+            </w:tcMar>
             <w:vAlign w:val="center"/>
           </w:tcPr>
           <w:p>
@@ -1396,17 +1614,22 @@
                 <w:between w:color="000000" w:space="0" w:sz="0" w:val="none"/>
               </w:pBdr>
               <w:spacing w:after="0" w:before="0" w:line="240" w:lineRule="auto"/>
-              <w:jc w:val="center"/>
               <w:rPr/>
             </w:pPr>
             <w:r>
               <w:rPr>
                 <w:rtl w:val="0"/>
               </w:rPr>
-              <w:t xml:space="preserve">{{customerAccountLabel}}</w:t>
-            </w:r>
-          </w:p>
-        </w:tc>
+              <w:t xml:space="preserve">{{executorAccount}}</w:t>
+            </w:r>
+          </w:p>
+        </w:tc>
+      </w:tr>
+      <w:tr>
+        <w:trPr>
+          <w:cantSplit w:val="0"/>
+          <w:tblHeader w:val="0"/>
+        </w:trPr>
         <w:tc>
           <w:tcPr>
             <w:tcBorders>
@@ -1416,28 +1639,11 @@
               <w:right w:color="000000" w:space="0" w:sz="0" w:val="nil"/>
             </w:tcBorders>
             <w:tcMar>
-              <w:top w:w="100.0" w:type="dxa"/>
-              <w:left w:w="100.0" w:type="dxa"/>
-              <w:bottom w:w="100.0" w:type="dxa"/>
-              <w:right w:w="100.0" w:type="dxa"/>
-            </w:tcMar>
-            <w:vAlign w:val="center"/>
-          </w:tcPr>
-          <w:p>
-            <w:pPr>
-              <w:spacing w:after="0" w:before="0" w:line="288" w:lineRule="auto"/>
-              <w:rPr/>
-            </w:pPr>
-            <w:r>
-              <w:rPr>
-                <w:rtl w:val="0"/>
-              </w:rPr>
-              <w:t xml:space="preserve">{{customerAccount}}</w:t>
-            </w:r>
-          </w:p>
-        </w:tc>
-        <w:tc>
-          <w:tcPr>
+              <w:top w:w="99.77952755905513" w:type="dxa"/>
+              <w:left w:w="99.77952755905513" w:type="dxa"/>
+              <w:bottom w:w="99.77952755905513" w:type="dxa"/>
+              <w:right w:w="99.77952755905513" w:type="dxa"/>
+            </w:tcMar>
             <w:vAlign w:val="center"/>
           </w:tcPr>
           <w:p>
@@ -1458,7 +1664,7 @@
               <w:rPr>
                 <w:rtl w:val="0"/>
               </w:rPr>
-              <w:t xml:space="preserve">{{executorAccountLabel}}</w:t>
+              <w:t xml:space="preserve">Банк</w:t>
             </w:r>
           </w:p>
         </w:tc>
@@ -1468,14 +1674,37 @@
               <w:top w:color="000000" w:space="0" w:sz="0" w:val="nil"/>
               <w:left w:color="000000" w:space="0" w:sz="0" w:val="nil"/>
               <w:bottom w:color="000000" w:space="0" w:sz="0" w:val="nil"/>
-              <w:right w:color="000000" w:space="0" w:sz="0" w:val="nil"/>
             </w:tcBorders>
             <w:shd w:fill="auto" w:val="clear"/>
             <w:tcMar>
-              <w:top w:w="100.0" w:type="dxa"/>
-              <w:left w:w="100.0" w:type="dxa"/>
-              <w:bottom w:w="100.0" w:type="dxa"/>
-              <w:right w:w="100.0" w:type="dxa"/>
+              <w:top w:w="99.77952755905513" w:type="dxa"/>
+              <w:left w:w="99.77952755905513" w:type="dxa"/>
+              <w:bottom w:w="99.77952755905513" w:type="dxa"/>
+              <w:right w:w="99.77952755905513" w:type="dxa"/>
+            </w:tcMar>
+            <w:vAlign w:val="top"/>
+          </w:tcPr>
+          <w:p>
+            <w:pPr>
+              <w:spacing w:after="0" w:before="0" w:line="240" w:lineRule="auto"/>
+              <w:jc w:val="both"/>
+              <w:rPr/>
+            </w:pPr>
+            <w:r>
+              <w:rPr>
+                <w:rtl w:val="0"/>
+              </w:rPr>
+              <w:t xml:space="preserve">{{customerBank}}</w:t>
+            </w:r>
+          </w:p>
+        </w:tc>
+        <w:tc>
+          <w:tcPr>
+            <w:tcMar>
+              <w:top w:w="99.77952755905513" w:type="dxa"/>
+              <w:left w:w="99.77952755905513" w:type="dxa"/>
+              <w:bottom w:w="99.77952755905513" w:type="dxa"/>
+              <w:right w:w="99.77952755905513" w:type="dxa"/>
             </w:tcMar>
             <w:vAlign w:val="center"/>
           </w:tcPr>
@@ -1489,25 +1718,27 @@
                 <w:right w:color="000000" w:space="0" w:sz="0" w:val="none"/>
                 <w:between w:color="000000" w:space="0" w:sz="0" w:val="none"/>
               </w:pBdr>
-              <w:spacing w:after="0" w:before="0" w:lineRule="auto"/>
+              <w:spacing w:after="0" w:before="0" w:line="240" w:lineRule="auto"/>
+              <w:jc w:val="center"/>
               <w:rPr/>
             </w:pPr>
             <w:r>
               <w:rPr>
                 <w:rtl w:val="0"/>
               </w:rPr>
-              <w:t xml:space="preserve">{{executorAccount}}</w:t>
-            </w:r>
-          </w:p>
-        </w:tc>
-      </w:tr>
-      <w:tr>
-        <w:trPr>
-          <w:cantSplit w:val="0"/>
-          <w:tblHeader w:val="0"/>
-        </w:trPr>
-        <w:tc>
-          <w:tcPr>
+              <w:t xml:space="preserve">Банк</w:t>
+            </w:r>
+          </w:p>
+        </w:tc>
+        <w:tc>
+          <w:tcPr>
+            <w:shd w:fill="auto" w:val="clear"/>
+            <w:tcMar>
+              <w:top w:w="99.77952755905513" w:type="dxa"/>
+              <w:left w:w="99.77952755905513" w:type="dxa"/>
+              <w:bottom w:w="99.77952755905513" w:type="dxa"/>
+              <w:right w:w="99.77952755905513" w:type="dxa"/>
+            </w:tcMar>
             <w:vAlign w:val="center"/>
           </w:tcPr>
           <w:p>
@@ -1521,17 +1752,22 @@
                 <w:between w:color="000000" w:space="0" w:sz="0" w:val="none"/>
               </w:pBdr>
               <w:spacing w:after="0" w:before="0" w:line="240" w:lineRule="auto"/>
-              <w:jc w:val="center"/>
               <w:rPr/>
             </w:pPr>
             <w:r>
               <w:rPr>
                 <w:rtl w:val="0"/>
               </w:rPr>
-              <w:t xml:space="preserve">{{customerBankLabel}}</w:t>
-            </w:r>
-          </w:p>
-        </w:tc>
+              <w:t xml:space="preserve">{{executorBank}} </w:t>
+            </w:r>
+          </w:p>
+        </w:tc>
+      </w:tr>
+      <w:tr>
+        <w:trPr>
+          <w:cantSplit w:val="0"/>
+          <w:tblHeader w:val="0"/>
+        </w:trPr>
         <w:tc>
           <w:tcPr>
             <w:tcBorders>
@@ -1541,28 +1777,11 @@
               <w:right w:color="000000" w:space="0" w:sz="0" w:val="nil"/>
             </w:tcBorders>
             <w:tcMar>
-              <w:top w:w="100.0" w:type="dxa"/>
-              <w:left w:w="100.0" w:type="dxa"/>
-              <w:bottom w:w="100.0" w:type="dxa"/>
-              <w:right w:w="100.0" w:type="dxa"/>
-            </w:tcMar>
-            <w:vAlign w:val="center"/>
-          </w:tcPr>
-          <w:p>
-            <w:pPr>
-              <w:spacing w:after="0" w:before="0" w:line="288" w:lineRule="auto"/>
-              <w:rPr/>
-            </w:pPr>
-            <w:r>
-              <w:rPr>
-                <w:rtl w:val="0"/>
-              </w:rPr>
-              <w:t xml:space="preserve">{{customerBank}}</w:t>
-            </w:r>
-          </w:p>
-        </w:tc>
-        <w:tc>
-          <w:tcPr>
+              <w:top w:w="99.77952755905513" w:type="dxa"/>
+              <w:left w:w="99.77952755905513" w:type="dxa"/>
+              <w:bottom w:w="99.77952755905513" w:type="dxa"/>
+              <w:right w:w="99.77952755905513" w:type="dxa"/>
+            </w:tcMar>
             <w:vAlign w:val="center"/>
           </w:tcPr>
           <w:p>
@@ -1583,7 +1802,7 @@
               <w:rPr>
                 <w:rtl w:val="0"/>
               </w:rPr>
-              <w:t xml:space="preserve">{{executorBankLabel}}</w:t>
+              <w:t xml:space="preserve">К/с</w:t>
             </w:r>
           </w:p>
         </w:tc>
@@ -1595,12 +1814,38 @@
               <w:bottom w:color="000000" w:space="0" w:sz="0" w:val="nil"/>
               <w:right w:color="000000" w:space="0" w:sz="0" w:val="nil"/>
             </w:tcBorders>
-            <w:shd w:fill="auto" w:val="clear"/>
-            <w:tcMar>
-              <w:top w:w="100.0" w:type="dxa"/>
-              <w:left w:w="100.0" w:type="dxa"/>
-              <w:bottom w:w="100.0" w:type="dxa"/>
-              <w:right w:w="100.0" w:type="dxa"/>
+            <w:tcMar>
+              <w:top w:w="99.77952755905513" w:type="dxa"/>
+              <w:left w:w="99.77952755905513" w:type="dxa"/>
+              <w:bottom w:w="99.77952755905513" w:type="dxa"/>
+              <w:right w:w="99.77952755905513" w:type="dxa"/>
+            </w:tcMar>
+            <w:vAlign w:val="center"/>
+          </w:tcPr>
+          <w:p>
+            <w:pPr>
+              <w:spacing w:after="0" w:before="0" w:line="240" w:lineRule="auto"/>
+              <w:jc w:val="both"/>
+              <w:rPr/>
+            </w:pPr>
+            <w:r>
+              <w:rPr>
+                <w:rtl w:val="0"/>
+              </w:rPr>
+              <w:t xml:space="preserve">{{customerCorr}}</w:t>
+            </w:r>
+          </w:p>
+        </w:tc>
+        <w:tc>
+          <w:tcPr>
+            <w:tcBorders>
+              <w:left w:color="000000" w:space="0" w:sz="0" w:val="nil"/>
+            </w:tcBorders>
+            <w:tcMar>
+              <w:top w:w="99.77952755905513" w:type="dxa"/>
+              <w:left w:w="99.77952755905513" w:type="dxa"/>
+              <w:bottom w:w="99.77952755905513" w:type="dxa"/>
+              <w:right w:w="99.77952755905513" w:type="dxa"/>
             </w:tcMar>
             <w:vAlign w:val="center"/>
           </w:tcPr>
@@ -1614,25 +1859,27 @@
                 <w:right w:color="000000" w:space="0" w:sz="0" w:val="none"/>
                 <w:between w:color="000000" w:space="0" w:sz="0" w:val="none"/>
               </w:pBdr>
-              <w:spacing w:after="0" w:before="0" w:lineRule="auto"/>
+              <w:spacing w:after="0" w:before="0" w:line="240" w:lineRule="auto"/>
+              <w:jc w:val="center"/>
               <w:rPr/>
             </w:pPr>
             <w:r>
               <w:rPr>
                 <w:rtl w:val="0"/>
               </w:rPr>
-              <w:t xml:space="preserve">{{executorBank}}</w:t>
-            </w:r>
-          </w:p>
-        </w:tc>
-      </w:tr>
-      <w:tr>
-        <w:trPr>
-          <w:cantSplit w:val="0"/>
-          <w:tblHeader w:val="0"/>
-        </w:trPr>
-        <w:tc>
-          <w:tcPr>
+              <w:t xml:space="preserve">К/с</w:t>
+            </w:r>
+          </w:p>
+        </w:tc>
+        <w:tc>
+          <w:tcPr>
+            <w:shd w:fill="auto" w:val="clear"/>
+            <w:tcMar>
+              <w:top w:w="99.77952755905513" w:type="dxa"/>
+              <w:left w:w="99.77952755905513" w:type="dxa"/>
+              <w:bottom w:w="99.77952755905513" w:type="dxa"/>
+              <w:right w:w="99.77952755905513" w:type="dxa"/>
+            </w:tcMar>
             <w:vAlign w:val="center"/>
           </w:tcPr>
           <w:p>
@@ -1646,17 +1893,23 @@
                 <w:between w:color="000000" w:space="0" w:sz="0" w:val="none"/>
               </w:pBdr>
               <w:spacing w:after="0" w:before="0" w:line="240" w:lineRule="auto"/>
-              <w:jc w:val="center"/>
               <w:rPr/>
             </w:pPr>
             <w:r>
               <w:rPr>
                 <w:rtl w:val="0"/>
               </w:rPr>
-              <w:t xml:space="preserve">{{customerCorrLabel}}</w:t>
-            </w:r>
-          </w:p>
-        </w:tc>
+              <w:t xml:space="preserve">{{executorCorr}} </w:t>
+            </w:r>
+          </w:p>
+        </w:tc>
+      </w:tr>
+      <w:tr>
+        <w:trPr>
+          <w:cantSplit w:val="0"/>
+          <w:trHeight w:val="212.373046875" w:hRule="atLeast"/>
+          <w:tblHeader w:val="0"/>
+        </w:trPr>
         <w:tc>
           <w:tcPr>
             <w:tcBorders>
@@ -1666,28 +1919,11 @@
               <w:right w:color="000000" w:space="0" w:sz="0" w:val="nil"/>
             </w:tcBorders>
             <w:tcMar>
-              <w:top w:w="100.0" w:type="dxa"/>
-              <w:left w:w="100.0" w:type="dxa"/>
-              <w:bottom w:w="100.0" w:type="dxa"/>
-              <w:right w:w="100.0" w:type="dxa"/>
-            </w:tcMar>
-            <w:vAlign w:val="center"/>
-          </w:tcPr>
-          <w:p>
-            <w:pPr>
-              <w:spacing w:after="0" w:before="0" w:line="288" w:lineRule="auto"/>
-              <w:rPr/>
-            </w:pPr>
-            <w:r>
-              <w:rPr>
-                <w:rtl w:val="0"/>
-              </w:rPr>
-              <w:t xml:space="preserve">{{customerCorr}}</w:t>
-            </w:r>
-          </w:p>
-        </w:tc>
-        <w:tc>
-          <w:tcPr>
+              <w:top w:w="99.77952755905513" w:type="dxa"/>
+              <w:left w:w="99.77952755905513" w:type="dxa"/>
+              <w:bottom w:w="99.77952755905513" w:type="dxa"/>
+              <w:right w:w="99.77952755905513" w:type="dxa"/>
+            </w:tcMar>
             <w:vAlign w:val="center"/>
           </w:tcPr>
           <w:p>
@@ -1708,7 +1944,7 @@
               <w:rPr>
                 <w:rtl w:val="0"/>
               </w:rPr>
-              <w:t xml:space="preserve">{{executorCorrLabel}}</w:t>
+              <w:t xml:space="preserve">БИК</w:t>
             </w:r>
           </w:p>
         </w:tc>
@@ -1720,12 +1956,38 @@
               <w:bottom w:color="000000" w:space="0" w:sz="0" w:val="nil"/>
               <w:right w:color="000000" w:space="0" w:sz="0" w:val="nil"/>
             </w:tcBorders>
-            <w:shd w:fill="auto" w:val="clear"/>
-            <w:tcMar>
-              <w:top w:w="100.0" w:type="dxa"/>
-              <w:left w:w="100.0" w:type="dxa"/>
-              <w:bottom w:w="100.0" w:type="dxa"/>
-              <w:right w:w="100.0" w:type="dxa"/>
+            <w:tcMar>
+              <w:top w:w="99.77952755905513" w:type="dxa"/>
+              <w:left w:w="99.77952755905513" w:type="dxa"/>
+              <w:bottom w:w="99.77952755905513" w:type="dxa"/>
+              <w:right w:w="99.77952755905513" w:type="dxa"/>
+            </w:tcMar>
+            <w:vAlign w:val="center"/>
+          </w:tcPr>
+          <w:p>
+            <w:pPr>
+              <w:spacing w:after="0" w:before="0" w:line="240" w:lineRule="auto"/>
+              <w:jc w:val="both"/>
+              <w:rPr/>
+            </w:pPr>
+            <w:r>
+              <w:rPr>
+                <w:rtl w:val="0"/>
+              </w:rPr>
+              <w:t xml:space="preserve">{{customerBik}}</w:t>
+            </w:r>
+          </w:p>
+        </w:tc>
+        <w:tc>
+          <w:tcPr>
+            <w:tcBorders>
+              <w:left w:color="000000" w:space="0" w:sz="0" w:val="nil"/>
+            </w:tcBorders>
+            <w:tcMar>
+              <w:top w:w="99.77952755905513" w:type="dxa"/>
+              <w:left w:w="99.77952755905513" w:type="dxa"/>
+              <w:bottom w:w="99.77952755905513" w:type="dxa"/>
+              <w:right w:w="99.77952755905513" w:type="dxa"/>
             </w:tcMar>
             <w:vAlign w:val="center"/>
           </w:tcPr>
@@ -1739,37 +2001,6 @@
                 <w:right w:color="000000" w:space="0" w:sz="0" w:val="none"/>
                 <w:between w:color="000000" w:space="0" w:sz="0" w:val="none"/>
               </w:pBdr>
-              <w:spacing w:after="0" w:before="0" w:lineRule="auto"/>
-              <w:rPr/>
-            </w:pPr>
-            <w:r>
-              <w:rPr>
-                <w:rtl w:val="0"/>
-              </w:rPr>
-              <w:t xml:space="preserve">{{executorCorr}}</w:t>
-            </w:r>
-          </w:p>
-        </w:tc>
-      </w:tr>
-      <w:tr>
-        <w:trPr>
-          <w:cantSplit w:val="0"/>
-          <w:tblHeader w:val="0"/>
-        </w:trPr>
-        <w:tc>
-          <w:tcPr>
-            <w:vAlign w:val="center"/>
-          </w:tcPr>
-          <w:p>
-            <w:pPr>
-              <w:widowControl w:val="1"/>
-              <w:pBdr>
-                <w:top w:color="000000" w:space="0" w:sz="0" w:val="none"/>
-                <w:left w:color="000000" w:space="0" w:sz="0" w:val="none"/>
-                <w:bottom w:color="000000" w:space="0" w:sz="0" w:val="none"/>
-                <w:right w:color="000000" w:space="0" w:sz="0" w:val="none"/>
-                <w:between w:color="000000" w:space="0" w:sz="0" w:val="none"/>
-              </w:pBdr>
               <w:spacing w:after="0" w:before="0" w:line="240" w:lineRule="auto"/>
               <w:jc w:val="center"/>
               <w:rPr/>
@@ -1778,85 +2009,24 @@
               <w:rPr>
                 <w:rtl w:val="0"/>
               </w:rPr>
-              <w:t xml:space="preserve">{{customerBikLabel}}</w:t>
-            </w:r>
-          </w:p>
-        </w:tc>
-        <w:tc>
-          <w:tcPr>
-            <w:tcBorders>
-              <w:top w:color="000000" w:space="0" w:sz="0" w:val="nil"/>
-              <w:left w:color="000000" w:space="0" w:sz="0" w:val="nil"/>
-              <w:bottom w:color="000000" w:space="0" w:sz="0" w:val="nil"/>
-              <w:right w:color="000000" w:space="0" w:sz="0" w:val="nil"/>
-            </w:tcBorders>
-            <w:tcMar>
-              <w:top w:w="100.0" w:type="dxa"/>
-              <w:left w:w="100.0" w:type="dxa"/>
-              <w:bottom w:w="100.0" w:type="dxa"/>
-              <w:right w:w="100.0" w:type="dxa"/>
-            </w:tcMar>
-            <w:vAlign w:val="center"/>
-          </w:tcPr>
-          <w:p>
-            <w:pPr>
-              <w:spacing w:after="0" w:before="0" w:line="288" w:lineRule="auto"/>
-              <w:rPr/>
-            </w:pPr>
-            <w:r>
-              <w:rPr>
-                <w:rtl w:val="0"/>
-              </w:rPr>
-              <w:t xml:space="preserve">{{customerBik}}</w:t>
-            </w:r>
-          </w:p>
-        </w:tc>
-        <w:tc>
-          <w:tcPr>
-            <w:vAlign w:val="center"/>
-          </w:tcPr>
-          <w:p>
-            <w:pPr>
-              <w:widowControl w:val="1"/>
-              <w:pBdr>
-                <w:top w:color="000000" w:space="0" w:sz="0" w:val="none"/>
-                <w:left w:color="000000" w:space="0" w:sz="0" w:val="none"/>
-                <w:bottom w:color="000000" w:space="0" w:sz="0" w:val="none"/>
-                <w:right w:color="000000" w:space="0" w:sz="0" w:val="none"/>
-                <w:between w:color="000000" w:space="0" w:sz="0" w:val="none"/>
-              </w:pBdr>
-              <w:spacing w:after="0" w:before="0" w:line="240" w:lineRule="auto"/>
-              <w:jc w:val="center"/>
-              <w:rPr/>
-            </w:pPr>
-            <w:r>
-              <w:rPr>
-                <w:rtl w:val="0"/>
-              </w:rPr>
-              <w:t xml:space="preserve">{{executorBikLabel}}</w:t>
-            </w:r>
-          </w:p>
-        </w:tc>
-        <w:tc>
-          <w:tcPr>
-            <w:tcBorders>
-              <w:top w:color="000000" w:space="0" w:sz="0" w:val="nil"/>
-              <w:left w:color="000000" w:space="0" w:sz="0" w:val="nil"/>
-              <w:bottom w:color="000000" w:space="0" w:sz="0" w:val="nil"/>
-              <w:right w:color="000000" w:space="0" w:sz="0" w:val="nil"/>
-            </w:tcBorders>
+              <w:t xml:space="preserve">БИК</w:t>
+            </w:r>
+          </w:p>
+        </w:tc>
+        <w:tc>
+          <w:tcPr>
             <w:shd w:fill="auto" w:val="clear"/>
             <w:tcMar>
-              <w:top w:w="100.0" w:type="dxa"/>
-              <w:left w:w="100.0" w:type="dxa"/>
-              <w:bottom w:w="100.0" w:type="dxa"/>
-              <w:right w:w="100.0" w:type="dxa"/>
-            </w:tcMar>
-            <w:vAlign w:val="center"/>
-          </w:tcPr>
-          <w:p>
-            <w:pPr>
-              <w:spacing w:after="0" w:before="0" w:lineRule="auto"/>
+              <w:top w:w="99.77952755905513" w:type="dxa"/>
+              <w:left w:w="99.77952755905513" w:type="dxa"/>
+              <w:bottom w:w="99.77952755905513" w:type="dxa"/>
+              <w:right w:w="99.77952755905513" w:type="dxa"/>
+            </w:tcMar>
+            <w:vAlign w:val="center"/>
+          </w:tcPr>
+          <w:p>
+            <w:pPr>
+              <w:spacing w:after="0" w:before="0" w:line="240" w:lineRule="auto"/>
               <w:rPr/>
             </w:pPr>
             <w:r>
@@ -1913,7 +2083,7 @@
       <w:tr>
         <w:trPr>
           <w:cantSplit w:val="0"/>
-          <w:trHeight w:val="1905" w:hRule="atLeast"/>
+          <w:trHeight w:val="195" w:hRule="atLeast"/>
           <w:tblHeader w:val="0"/>
         </w:trPr>
         <w:tc>
@@ -1948,15 +2118,6 @@
               </w:rPr>
               <w:t xml:space="preserve">{{customerPosition}}</w:t>
             </w:r>
-          </w:p>
-          <w:p>
-            <w:pPr>
-              <w:spacing w:after="0" w:before="0" w:line="240" w:lineRule="auto"/>
-              <w:rPr>
-                <w:b w:val="1"/>
-                <w:bCs w:val="1"/>
-              </w:rPr>
-            </w:pPr>
             <w:r>
               <w:rPr>
                 <w:rtl w:val="0"/>
@@ -2005,7 +2166,7 @@
               <w:rPr>
                 <w:rtl w:val="0"/>
               </w:rPr>
-              <w:t xml:space="preserve">{{customerStamp}}</w:t>
+              <w:t xml:space="preserve">М. П.</w:t>
             </w:r>
             <w:r>
               <w:rPr>
@@ -2044,46 +2205,44 @@
                 <w:bCs w:val="1"/>
                 <w:rtl w:val="0"/>
               </w:rPr>
-              <w:t xml:space="preserve">{{executorPosition}}</w:t>
-            </w:r>
-          </w:p>
-          <w:p>
-            <w:pPr>
-              <w:spacing w:after="0" w:before="0" w:line="240" w:lineRule="auto"/>
-              <w:rPr>
-                <w:b w:val="1"/>
-                <w:bCs w:val="1"/>
-              </w:rPr>
-            </w:pPr>
-            <w:r>
-              <w:rPr>
-                <w:rtl w:val="0"/>
-              </w:rPr>
-              <w:br w:type="textWrapping"/>
-            </w:r>
-            <w:r>
-              <w:rPr>
-                <w:rtl w:val="0"/>
-              </w:rPr>
-            </w:r>
-          </w:p>
-          <w:p>
-            <w:pPr>
-              <w:spacing w:after="0" w:before="0" w:line="240" w:lineRule="auto"/>
-              <w:rPr/>
-            </w:pPr>
-            <w:r>
-              <w:rPr>
-                <w:rtl w:val="0"/>
-              </w:rPr>
-              <w:t xml:space="preserve">_____________________ /</w:t>
-            </w:r>
-            <w:r>
-              <w:rPr>
-                <w:highlight w:val="white"/>
-                <w:rtl w:val="0"/>
-              </w:rPr>
-              <w:t xml:space="preserve"> {{executorSignature}}</w:t>
+              <w:t xml:space="preserve">{{executorName}}</w:t>
+            </w:r>
+          </w:p>
+          <w:p>
+            <w:pPr>
+              <w:spacing w:after="0" w:before="0" w:line="240" w:lineRule="auto"/>
+              <w:rPr>
+                <w:b w:val="1"/>
+                <w:bCs w:val="1"/>
+              </w:rPr>
+            </w:pPr>
+            <w:r>
+              <w:rPr>
+                <w:rtl w:val="0"/>
+              </w:rPr>
+            </w:r>
+          </w:p>
+          <w:p>
+            <w:pPr>
+              <w:spacing w:after="0" w:before="0" w:line="240" w:lineRule="auto"/>
+              <w:rPr>
+                <w:b w:val="1"/>
+                <w:bCs w:val="1"/>
+              </w:rPr>
+            </w:pPr>
+            <w:r>
+              <w:rPr>
+                <w:b w:val="1"/>
+                <w:bCs w:val="1"/>
+                <w:rtl w:val="0"/>
+              </w:rPr>
+              <w:t xml:space="preserve">_____________________ / </w:t>
+            </w:r>
+            <w:r>
+              <w:rPr>
+                <w:rtl w:val="0"/>
+              </w:rPr>
+              <w:t xml:space="preserve">{{executorSignature}}</w:t>
             </w:r>
             <w:r>
               <w:rPr>
@@ -2094,22 +2253,6 @@
         </w:tc>
       </w:tr>
     </w:tbl>
-    <w:p>
-      <w:pPr>
-        <w:widowControl w:val="1"/>
-        <w:spacing w:after="0" w:before="0" w:line="240" w:lineRule="auto"/>
-        <w:jc w:val="right"/>
-        <w:rPr>
-          <w:b w:val="1"/>
-          <w:bCs w:val="1"/>
-        </w:rPr>
-      </w:pPr>
-      <w:r>
-        <w:rPr>
-          <w:rtl w:val="0"/>
-        </w:rPr>
-      </w:r>
-    </w:p>
     <w:p>
       <w:pPr>
         <w:widowControl w:val="1"/>
@@ -2121,9 +2264,13 @@
           <w:between w:space="0" w:sz="0" w:val="nil"/>
         </w:pBdr>
         <w:spacing w:after="0" w:before="0" w:line="240" w:lineRule="auto"/>
+        <w:ind w:left="0" w:firstLine="0"/>
         <w:jc w:val="right"/>
         <w:rPr/>
       </w:pPr>
+      <w:r>
+        <w:br w:type="page"/>
+      </w:r>
       <w:r>
         <w:rPr>
           <w:rtl w:val="0"/>
@@ -2141,6 +2288,7 @@
           <w:between w:space="0" w:sz="0" w:val="nil"/>
         </w:pBdr>
         <w:spacing w:after="0" w:before="0" w:line="240" w:lineRule="auto"/>
+        <w:ind w:left="0" w:firstLine="0"/>
         <w:jc w:val="right"/>
         <w:rPr/>
       </w:pPr>
@@ -2148,6 +2296,7 @@
         <w:rPr>
           <w:rtl w:val="0"/>
         </w:rPr>
+        <w:t xml:space="preserve">Приложение № 1</w:t>
       </w:r>
     </w:p>
     <w:p>
@@ -2161,16 +2310,15 @@
           <w:between w:space="0" w:sz="0" w:val="nil"/>
         </w:pBdr>
         <w:spacing w:after="0" w:before="0" w:line="240" w:lineRule="auto"/>
+        <w:ind w:left="7086.614173228345" w:firstLine="0"/>
         <w:jc w:val="right"/>
         <w:rPr/>
       </w:pPr>
       <w:r>
-        <w:br w:type="page"/>
-      </w:r>
-      <w:r>
-        <w:rPr>
-          <w:rtl w:val="0"/>
-        </w:rPr>
+        <w:rPr>
+          <w:rtl w:val="0"/>
+        </w:rPr>
+        <w:t xml:space="preserve">к Договору оказания услуг</w:t>
       </w:r>
     </w:p>
     <w:p>
@@ -2185,13 +2333,14 @@
         </w:pBdr>
         <w:spacing w:after="0" w:before="0" w:line="240" w:lineRule="auto"/>
         <w:ind w:left="7086.614173228345" w:firstLine="0"/>
+        <w:jc w:val="right"/>
         <w:rPr/>
       </w:pPr>
       <w:r>
         <w:rPr>
           <w:rtl w:val="0"/>
         </w:rPr>
-        <w:t xml:space="preserve">Приложение № 1</w:t>
+        <w:t xml:space="preserve">{{appendixReference}}</w:t>
       </w:r>
     </w:p>
     <w:p>
@@ -2206,13 +2355,13 @@
         </w:pBdr>
         <w:spacing w:after="0" w:before="0" w:line="240" w:lineRule="auto"/>
         <w:ind w:left="7086.614173228345" w:firstLine="0"/>
+        <w:jc w:val="right"/>
         <w:rPr/>
       </w:pPr>
       <w:r>
         <w:rPr>
           <w:rtl w:val="0"/>
         </w:rPr>
-        <w:t xml:space="preserve">{{appendixContract}}</w:t>
       </w:r>
     </w:p>
     <w:p>
@@ -2225,15 +2374,20 @@
           <w:right w:space="0" w:sz="0" w:val="nil"/>
           <w:between w:space="0" w:sz="0" w:val="nil"/>
         </w:pBdr>
-        <w:spacing w:after="200" w:before="0" w:line="240" w:lineRule="auto"/>
-        <w:ind w:left="7086.614173228345" w:firstLine="0"/>
-        <w:rPr/>
-      </w:pPr>
-      <w:r>
-        <w:rPr>
-          <w:rtl w:val="0"/>
-        </w:rPr>
-        <w:t xml:space="preserve">{{appendixReference}}</w:t>
+        <w:spacing w:after="0" w:before="0" w:line="240" w:lineRule="auto"/>
+        <w:jc w:val="center"/>
+        <w:rPr>
+          <w:b w:val="1"/>
+          <w:bCs w:val="1"/>
+        </w:rPr>
+      </w:pPr>
+      <w:r>
+        <w:rPr>
+          <w:b w:val="1"/>
+          <w:bCs w:val="1"/>
+          <w:rtl w:val="0"/>
+        </w:rPr>
+        <w:t xml:space="preserve">СПЕЦИФИКАЦИЯ № 1 </w:t>
       </w:r>
     </w:p>
     <w:p>
@@ -2246,7 +2400,7 @@
           <w:right w:space="0" w:sz="0" w:val="nil"/>
           <w:between w:space="0" w:sz="0" w:val="nil"/>
         </w:pBdr>
-        <w:spacing w:after="200" w:before="0" w:line="240" w:lineRule="auto"/>
+        <w:spacing w:after="0" w:before="0" w:line="240" w:lineRule="auto"/>
         <w:jc w:val="center"/>
         <w:rPr>
           <w:b w:val="1"/>
@@ -2255,11 +2409,8 @@
       </w:pPr>
       <w:r>
         <w:rPr>
-          <w:b w:val="1"/>
-          <w:bCs w:val="1"/>
-          <w:rtl w:val="0"/>
-        </w:rPr>
-        <w:t xml:space="preserve">СПЕЦИФИКАЦИЯ № 1 </w:t>
+          <w:rtl w:val="0"/>
+        </w:rPr>
       </w:r>
     </w:p>
     <w:tbl>
@@ -2705,7 +2856,7 @@
                 <w:bCs w:val="1"/>
                 <w:rtl w:val="0"/>
               </w:rPr>
-              <w:t xml:space="preserve">{{itemGroup}}</w:t>
+              <w:t xml:space="preserve">Услуги</w:t>
             </w:r>
             <w:r>
               <w:rPr>
@@ -2772,7 +2923,7 @@
           </w:tcPr>
           <w:p>
             <w:pPr>
-              <w:spacing w:after="0" w:before="0" w:lineRule="auto"/>
+              <w:spacing w:after="0" w:before="0" w:line="240" w:lineRule="auto"/>
               <w:jc w:val="center"/>
               <w:rPr/>
             </w:pPr>
@@ -2802,7 +2953,7 @@
           </w:tcPr>
           <w:p>
             <w:pPr>
-              <w:spacing w:after="0" w:before="0" w:lineRule="auto"/>
+              <w:spacing w:after="0" w:before="0" w:line="240" w:lineRule="auto"/>
               <w:jc w:val="center"/>
               <w:rPr/>
             </w:pPr>
@@ -2832,7 +2983,7 @@
           </w:tcPr>
           <w:p>
             <w:pPr>
-              <w:spacing w:after="0" w:before="0" w:lineRule="auto"/>
+              <w:spacing w:after="0" w:before="0" w:line="240" w:lineRule="auto"/>
               <w:jc w:val="center"/>
               <w:rPr/>
             </w:pPr>
@@ -2863,7 +3014,7 @@
           </w:tcPr>
           <w:p>
             <w:pPr>
-              <w:spacing w:after="0" w:before="0" w:lineRule="auto"/>
+              <w:spacing w:after="0" w:before="0" w:line="240" w:lineRule="auto"/>
               <w:jc w:val="center"/>
               <w:rPr/>
             </w:pPr>
@@ -2894,8 +3045,8 @@
           </w:tcPr>
           <w:p>
             <w:pPr>
-              <w:spacing w:after="0" w:before="0" w:lineRule="auto"/>
-              <w:jc w:val="center"/>
+              <w:spacing w:after="0" w:before="0" w:line="240" w:lineRule="auto"/>
+              <w:jc w:val="right"/>
               <w:rPr/>
             </w:pPr>
             <w:bookmarkStart w:colFirst="0" w:colLast="0" w:name="_30j0zll" w:id="1"/>
@@ -2927,8 +3078,8 @@
           </w:tcPr>
           <w:p>
             <w:pPr>
-              <w:spacing w:after="0" w:before="0" w:lineRule="auto"/>
-              <w:jc w:val="center"/>
+              <w:spacing w:after="0" w:before="0" w:line="240" w:lineRule="auto"/>
+              <w:jc w:val="right"/>
               <w:rPr/>
             </w:pPr>
             <w:r>
@@ -3010,7 +3161,7 @@
                 <w:bCs w:val="1"/>
                 <w:rtl w:val="0"/>
               </w:rPr>
-              <w:t xml:space="preserve">{{totalLabel}}</w:t>
+              <w:t xml:space="preserve">ИТОГО:</w:t>
             </w:r>
           </w:p>
         </w:tc>
@@ -3034,7 +3185,7 @@
           <w:p>
             <w:pPr>
               <w:spacing w:after="0" w:before="0" w:line="240" w:lineRule="auto"/>
-              <w:jc w:val="center"/>
+              <w:jc w:val="right"/>
               <w:rPr>
                 <w:b w:val="1"/>
                 <w:bCs w:val="1"/>
@@ -3055,7 +3206,7 @@
     <w:p>
       <w:pPr>
         <w:widowControl w:val="1"/>
-        <w:spacing w:after="0" w:before="200" w:line="240" w:lineRule="auto"/>
+        <w:spacing w:after="0" w:before="0" w:line="240" w:lineRule="auto"/>
         <w:ind w:firstLine="720.0000000000001"/>
         <w:jc w:val="both"/>
         <w:rPr/>
@@ -3064,7 +3215,7 @@
         <w:rPr>
           <w:rtl w:val="0"/>
         </w:rPr>
-        <w:t xml:space="preserve">{{appendixPayment}}</w:t>
+        <w:t xml:space="preserve">Порядок расчетов: оплата производится Заказчиком путем перечисления денежных средств на расчетный счет Исполнителя в размере 100% оплаты в течение 15 (Пятнадцати) календарных дней с момента подписания Акта об оказании услуг.</w:t>
       </w:r>
     </w:p>
     <w:p>
@@ -3079,26 +3230,44 @@
         <w:rPr>
           <w:rtl w:val="0"/>
         </w:rPr>
-        <w:t xml:space="preserve">{{appendixTotal}}</w:t>
+        <w:t xml:space="preserve">Общая стоимость настоящего Приложения составляет: {{amountWithWords}} НДС не облагается в связи с применением Исполнителем специального налогового режима «Налог на профессиональный доход» на основании Федерального закона от 27.11.2018 № 422-ФЗ».</w:t>
       </w:r>
     </w:p>
     <w:p>
       <w:pPr>
         <w:widowControl w:val="1"/>
-        <w:spacing w:after="200" w:before="0" w:line="240" w:lineRule="auto"/>
+        <w:spacing w:after="0" w:before="0" w:line="240" w:lineRule="auto"/>
         <w:ind w:firstLine="720.0000000000001"/>
         <w:jc w:val="both"/>
-        <w:rPr>
-          <w:b w:val="1"/>
-          <w:bCs w:val="1"/>
-        </w:rPr>
-      </w:pPr>
-      <w:r>
-        <w:rPr>
-          <w:rtl w:val="0"/>
-        </w:rPr>
-        <w:t xml:space="preserve">{{deadline}}</w:t>
-      </w:r>
+        <w:rPr/>
+      </w:pPr>
+      <w:r>
+        <w:rPr>
+          <w:rtl w:val="0"/>
+        </w:rPr>
+        <w:t xml:space="preserve">Срок оказания услуг: {{servicePeriod}}</w:t>
+      </w:r>
+      <w:r>
+        <w:rPr>
+          <w:rtl w:val="0"/>
+        </w:rPr>
+        <w:t xml:space="preserve"/>
+      </w:r>
+      <w:r>
+        <w:rPr>
+          <w:rtl w:val="0"/>
+        </w:rPr>
+        <w:t xml:space="preserve"/>
+      </w:r>
+    </w:p>
+    <w:p>
+      <w:pPr>
+        <w:widowControl w:val="1"/>
+        <w:spacing w:after="0" w:before="0" w:line="240" w:lineRule="auto"/>
+        <w:ind w:left="0" w:firstLine="0"/>
+        <w:jc w:val="both"/>
+        <w:rPr/>
+      </w:pPr>
       <w:r>
         <w:rPr>
           <w:rtl w:val="0"/>
@@ -3170,15 +3339,6 @@
               </w:rPr>
               <w:t xml:space="preserve">{{customerPosition}}</w:t>
             </w:r>
-          </w:p>
-          <w:p>
-            <w:pPr>
-              <w:spacing w:after="0" w:before="0" w:line="240" w:lineRule="auto"/>
-              <w:rPr>
-                <w:b w:val="1"/>
-                <w:bCs w:val="1"/>
-              </w:rPr>
-            </w:pPr>
             <w:r>
               <w:rPr>
                 <w:rtl w:val="0"/>
@@ -3227,7 +3387,7 @@
               <w:rPr>
                 <w:rtl w:val="0"/>
               </w:rPr>
-              <w:t xml:space="preserve">{{customerStamp}}</w:t>
+              <w:t xml:space="preserve">М. П.</w:t>
             </w:r>
             <w:r>
               <w:rPr>
@@ -3254,58 +3414,56 @@
           </w:tcPr>
           <w:p>
             <w:pPr>
-              <w:spacing w:after="0" w:before="0" w:lineRule="auto"/>
-              <w:rPr>
-                <w:b w:val="1"/>
-                <w:bCs w:val="1"/>
-              </w:rPr>
-            </w:pPr>
-            <w:r>
-              <w:rPr>
-                <w:b w:val="1"/>
-                <w:bCs w:val="1"/>
-                <w:rtl w:val="0"/>
-              </w:rPr>
-              <w:t xml:space="preserve">{{executorPosition}}</w:t>
-            </w:r>
-          </w:p>
-          <w:p>
-            <w:pPr>
-              <w:spacing w:after="0" w:before="0" w:line="240" w:lineRule="auto"/>
-              <w:rPr>
-                <w:b w:val="1"/>
-                <w:bCs w:val="1"/>
-              </w:rPr>
-            </w:pPr>
-            <w:r>
-              <w:rPr>
-                <w:rtl w:val="0"/>
-              </w:rPr>
-              <w:br w:type="textWrapping"/>
-            </w:r>
-            <w:r>
-              <w:rPr>
-                <w:rtl w:val="0"/>
-              </w:rPr>
-            </w:r>
-          </w:p>
-          <w:p>
-            <w:pPr>
-              <w:spacing w:after="0" w:before="0" w:line="240" w:lineRule="auto"/>
-              <w:rPr/>
-            </w:pPr>
-            <w:r>
-              <w:rPr>
-                <w:rtl w:val="0"/>
-              </w:rPr>
-              <w:t xml:space="preserve">_____________________ /</w:t>
-            </w:r>
-            <w:r>
-              <w:rPr>
-                <w:highlight w:val="white"/>
-                <w:rtl w:val="0"/>
-              </w:rPr>
-              <w:t xml:space="preserve"> {{executorSignature}}</w:t>
+              <w:spacing w:after="0" w:before="0" w:line="240" w:lineRule="auto"/>
+              <w:rPr>
+                <w:b w:val="1"/>
+                <w:bCs w:val="1"/>
+              </w:rPr>
+            </w:pPr>
+            <w:r>
+              <w:rPr>
+                <w:b w:val="1"/>
+                <w:bCs w:val="1"/>
+                <w:rtl w:val="0"/>
+              </w:rPr>
+              <w:t xml:space="preserve">{{executorName}}</w:t>
+            </w:r>
+          </w:p>
+          <w:p>
+            <w:pPr>
+              <w:spacing w:after="0" w:before="0" w:line="240" w:lineRule="auto"/>
+              <w:rPr>
+                <w:b w:val="1"/>
+                <w:bCs w:val="1"/>
+              </w:rPr>
+            </w:pPr>
+            <w:r>
+              <w:rPr>
+                <w:rtl w:val="0"/>
+              </w:rPr>
+            </w:r>
+          </w:p>
+          <w:p>
+            <w:pPr>
+              <w:spacing w:after="0" w:before="0" w:line="240" w:lineRule="auto"/>
+              <w:rPr>
+                <w:b w:val="1"/>
+                <w:bCs w:val="1"/>
+              </w:rPr>
+            </w:pPr>
+            <w:r>
+              <w:rPr>
+                <w:b w:val="1"/>
+                <w:bCs w:val="1"/>
+                <w:rtl w:val="0"/>
+              </w:rPr>
+              <w:t xml:space="preserve">_____________________ / </w:t>
+            </w:r>
+            <w:r>
+              <w:rPr>
+                <w:rtl w:val="0"/>
+              </w:rPr>
+              <w:t xml:space="preserve">{{executorSignature}}</w:t>
             </w:r>
             <w:r>
               <w:rPr>
@@ -3338,7 +3496,7 @@
           <w:right w:space="0" w:sz="0" w:val="nil"/>
           <w:between w:space="0" w:sz="0" w:val="nil"/>
         </w:pBdr>
-        <w:spacing w:after="120" w:line="240" w:lineRule="auto"/>
+        <w:spacing w:after="0" w:before="0" w:line="240" w:lineRule="auto"/>
         <w:rPr/>
       </w:pPr>
       <w:r>
@@ -3356,7 +3514,7 @@
           <w:right w:space="0" w:sz="0" w:val="nil"/>
           <w:between w:space="0" w:sz="0" w:val="nil"/>
         </w:pBdr>
-        <w:spacing w:after="120" w:line="240" w:lineRule="auto"/>
+        <w:spacing w:after="0" w:before="0" w:line="240" w:lineRule="auto"/>
         <w:rPr/>
       </w:pPr>
       <w:r>
@@ -3374,7 +3532,7 @@
           <w:right w:space="0" w:sz="0" w:val="nil"/>
           <w:between w:space="0" w:sz="0" w:val="nil"/>
         </w:pBdr>
-        <w:spacing w:after="120" w:line="240" w:lineRule="auto"/>
+        <w:spacing w:after="0" w:before="0" w:line="240" w:lineRule="auto"/>
         <w:rPr/>
       </w:pPr>
       <w:r>
@@ -3392,7 +3550,7 @@
           <w:right w:space="0" w:sz="0" w:val="nil"/>
           <w:between w:space="0" w:sz="0" w:val="nil"/>
         </w:pBdr>
-        <w:spacing w:after="120" w:line="240" w:lineRule="auto"/>
+        <w:spacing w:after="0" w:before="0" w:line="240" w:lineRule="auto"/>
         <w:rPr/>
       </w:pPr>
       <w:r>
@@ -3403,7 +3561,7 @@
     </w:p>
     <w:p>
       <w:pPr>
-        <w:spacing w:line="240" w:lineRule="auto"/>
+        <w:spacing w:after="0" w:before="0" w:line="240" w:lineRule="auto"/>
         <w:rPr>
           <w:b w:val="1"/>
           <w:bCs w:val="1"/>

</xml_diff>

<commit_message>
fix: update NPD documents and add editable templates (v50)
</commit_message>
<xml_diff>
--- a/docs/templates/services.docx
+++ b/docs/templates/services.docx
@@ -190,7 +190,7 @@
         <w:rPr>
           <w:rtl w:val="0"/>
         </w:rPr>
-        <w:t xml:space="preserve">, в лице {{customerSignerGen}}, действующего на основании {{customerBasis}}, именуемый в дальнейшем «Заказчик», с другой стороны, </w:t>
+        <w:t xml:space="preserve">{{customerPreambleTail}}</w:t>
       </w:r>
     </w:p>
     <w:p>
@@ -906,6 +906,7 @@
       <w:tr>
         <w:trPr>
           <w:cantSplit w:val="0"/>
+          <w:trHeight w:val="452.9296875" w:hRule="atLeast"/>
           <w:tblHeader w:val="0"/>
         </w:trPr>
         <w:tc>
@@ -946,7 +947,7 @@
                 <w:bCs w:val="1"/>
                 <w:rtl w:val="0"/>
               </w:rPr>
-              <w:t xml:space="preserve">Заказчик:</w:t>
+              <w:t xml:space="preserve">{{customerRoleColon}}</w:t>
             </w:r>
           </w:p>
           <w:p>
@@ -971,7 +972,7 @@
                 <w:bCs w:val="1"/>
                 <w:rtl w:val="0"/>
               </w:rPr>
-              <w:t xml:space="preserve">{{customerShortTitle}} </w:t>
+              <w:t xml:space="preserve">{{customerShortTitle}}</w:t>
             </w:r>
           </w:p>
         </w:tc>
@@ -1010,7 +1011,7 @@
                 <w:bCs w:val="1"/>
                 <w:rtl w:val="0"/>
               </w:rPr>
-              <w:t xml:space="preserve">Исполнитель:</w:t>
+              <w:t xml:space="preserve">{{executorRoleColon}}</w:t>
             </w:r>
           </w:p>
           <w:p>
@@ -1035,7 +1036,7 @@
                 <w:bCs w:val="1"/>
                 <w:rtl w:val="0"/>
               </w:rPr>
-              <w:t xml:space="preserve">Самозанятый {{executorName}}</w:t>
+              <w:t xml:space="preserve">{{executorNpdTitle}}</w:t>
             </w:r>
           </w:p>
         </w:tc>
@@ -1072,17 +1073,17 @@
                 <w:between w:color="000000" w:space="0" w:sz="0" w:val="none"/>
               </w:pBdr>
               <w:spacing w:after="0" w:before="0" w:line="240" w:lineRule="auto"/>
-              <w:jc w:val="left"/>
-              <w:rPr>
-                <w:b w:val="1"/>
-                <w:bCs w:val="1"/>
-              </w:rPr>
-            </w:pPr>
-            <w:r>
-              <w:rPr>
-                <w:rtl w:val="0"/>
-              </w:rPr>
-              <w:t xml:space="preserve">ОГРН</w:t>
+              <w:jc w:val="center"/>
+              <w:rPr>
+                <w:b w:val="1"/>
+                <w:bCs w:val="1"/>
+              </w:rPr>
+            </w:pPr>
+            <w:r>
+              <w:rPr>
+                <w:rtl w:val="0"/>
+              </w:rPr>
+              <w:t xml:space="preserve">{{customerRegistrationLabel}}</w:t>
             </w:r>
             <w:r>
               <w:rPr>
@@ -1150,7 +1151,7 @@
               <w:rPr>
                 <w:rtl w:val="0"/>
               </w:rPr>
-              <w:t xml:space="preserve">Паспорт</w:t>
+              <w:t xml:space="preserve">{{executorRegistrationLabel}}</w:t>
             </w:r>
             <w:r>
               <w:rPr>
@@ -1225,7 +1226,7 @@
               <w:rPr>
                 <w:rtl w:val="0"/>
               </w:rPr>
-              <w:t xml:space="preserve">Адрес</w:t>
+              <w:t xml:space="preserve">{{customerAddressLabel}}</w:t>
             </w:r>
             <w:r>
               <w:rPr>
@@ -1293,7 +1294,7 @@
               <w:rPr>
                 <w:rtl w:val="0"/>
               </w:rPr>
-              <w:t xml:space="preserve">Адрес</w:t>
+              <w:t xml:space="preserve">{{executorAddressLabel}}</w:t>
             </w:r>
             <w:r>
               <w:rPr>
@@ -1375,7 +1376,7 @@
               <w:rPr>
                 <w:rtl w:val="0"/>
               </w:rPr>
-              <w:t xml:space="preserve">ИНН / КПП</w:t>
+              <w:t xml:space="preserve">{{customerTaxLabel}}</w:t>
             </w:r>
           </w:p>
         </w:tc>
@@ -1447,7 +1448,7 @@
               <w:rPr>
                 <w:rtl w:val="0"/>
               </w:rPr>
-              <w:t xml:space="preserve">ИНН</w:t>
+              <w:t xml:space="preserve">{{executorTaxLabel}}</w:t>
             </w:r>
           </w:p>
         </w:tc>
@@ -1523,7 +1524,7 @@
               <w:rPr>
                 <w:rtl w:val="0"/>
               </w:rPr>
-              <w:t xml:space="preserve">Р/с</w:t>
+              <w:t xml:space="preserve">{{customerAccountLabel}}</w:t>
             </w:r>
           </w:p>
         </w:tc>
@@ -1588,7 +1589,7 @@
               <w:rPr>
                 <w:rtl w:val="0"/>
               </w:rPr>
-              <w:t xml:space="preserve">Р/с</w:t>
+              <w:t xml:space="preserve">{{executorAccountLabel}}</w:t>
             </w:r>
           </w:p>
         </w:tc>
@@ -1664,7 +1665,7 @@
               <w:rPr>
                 <w:rtl w:val="0"/>
               </w:rPr>
-              <w:t xml:space="preserve">Банк</w:t>
+              <w:t xml:space="preserve">{{customerBankLabel}}</w:t>
             </w:r>
           </w:p>
         </w:tc>
@@ -1726,7 +1727,7 @@
               <w:rPr>
                 <w:rtl w:val="0"/>
               </w:rPr>
-              <w:t xml:space="preserve">Банк</w:t>
+              <w:t xml:space="preserve">{{executorBankLabel}}</w:t>
             </w:r>
           </w:p>
         </w:tc>
@@ -1758,7 +1759,7 @@
               <w:rPr>
                 <w:rtl w:val="0"/>
               </w:rPr>
-              <w:t xml:space="preserve">{{executorBank}} </w:t>
+              <w:t xml:space="preserve">{{executorBank}}</w:t>
             </w:r>
           </w:p>
         </w:tc>
@@ -1802,7 +1803,7 @@
               <w:rPr>
                 <w:rtl w:val="0"/>
               </w:rPr>
-              <w:t xml:space="preserve">К/с</w:t>
+              <w:t xml:space="preserve">{{customerCorrLabel}}</w:t>
             </w:r>
           </w:p>
         </w:tc>
@@ -1867,7 +1868,7 @@
               <w:rPr>
                 <w:rtl w:val="0"/>
               </w:rPr>
-              <w:t xml:space="preserve">К/с</w:t>
+              <w:t xml:space="preserve">{{executorCorrLabel}}</w:t>
             </w:r>
           </w:p>
         </w:tc>
@@ -1899,7 +1900,7 @@
               <w:rPr>
                 <w:rtl w:val="0"/>
               </w:rPr>
-              <w:t xml:space="preserve">{{executorCorr}} </w:t>
+              <w:t xml:space="preserve">{{executorCorr}}</w:t>
             </w:r>
           </w:p>
         </w:tc>
@@ -1907,7 +1908,6 @@
       <w:tr>
         <w:trPr>
           <w:cantSplit w:val="0"/>
-          <w:trHeight w:val="212.373046875" w:hRule="atLeast"/>
           <w:tblHeader w:val="0"/>
         </w:trPr>
         <w:tc>
@@ -1944,7 +1944,7 @@
               <w:rPr>
                 <w:rtl w:val="0"/>
               </w:rPr>
-              <w:t xml:space="preserve">БИК</w:t>
+              <w:t xml:space="preserve">{{customerBikLabel}}</w:t>
             </w:r>
           </w:p>
         </w:tc>
@@ -2009,7 +2009,7 @@
               <w:rPr>
                 <w:rtl w:val="0"/>
               </w:rPr>
-              <w:t xml:space="preserve">БИК</w:t>
+              <w:t xml:space="preserve">{{executorBikLabel}}</w:t>
             </w:r>
           </w:p>
         </w:tc>
@@ -2166,7 +2166,7 @@
               <w:rPr>
                 <w:rtl w:val="0"/>
               </w:rPr>
-              <w:t xml:space="preserve">М. П.</w:t>
+              <w:t xml:space="preserve">{{customerStamp}}</w:t>
             </w:r>
             <w:r>
               <w:rPr>
@@ -2205,7 +2205,7 @@
                 <w:bCs w:val="1"/>
                 <w:rtl w:val="0"/>
               </w:rPr>
-              <w:t xml:space="preserve">{{executorName}}</w:t>
+              <w:t xml:space="preserve">{{executorPosition}}</w:t>
             </w:r>
           </w:p>
           <w:p>
@@ -2242,7 +2242,7 @@
               <w:rPr>
                 <w:rtl w:val="0"/>
               </w:rPr>
-              <w:t xml:space="preserve">{{executorSignature}}</w:t>
+              <w:t xml:space="preserve"> {{executorSignature}}</w:t>
             </w:r>
             <w:r>
               <w:rPr>
@@ -2431,8 +2431,8 @@
       </w:tblPr>
       <w:tblGrid>
         <w:gridCol w:w="570"/>
-        <w:gridCol w:w="2160"/>
-        <w:gridCol w:w="3675"/>
+        <w:gridCol w:w="1860"/>
+        <w:gridCol w:w="3975"/>
         <w:gridCol w:w="915"/>
         <w:gridCol w:w="960"/>
         <w:gridCol w:w="1185"/>
@@ -2440,8 +2440,8 @@
         <w:tblGridChange w:id="0">
           <w:tblGrid>
             <w:gridCol w:w="570"/>
-            <w:gridCol w:w="2160"/>
-            <w:gridCol w:w="3675"/>
+            <w:gridCol w:w="1860"/>
+            <w:gridCol w:w="3975"/>
             <w:gridCol w:w="915"/>
             <w:gridCol w:w="960"/>
             <w:gridCol w:w="1185"/>
@@ -3246,18 +3246,6 @@
           <w:rtl w:val="0"/>
         </w:rPr>
         <w:t xml:space="preserve">Срок оказания услуг: {{servicePeriod}}</w:t>
-      </w:r>
-      <w:r>
-        <w:rPr>
-          <w:rtl w:val="0"/>
-        </w:rPr>
-        <w:t xml:space="preserve"/>
-      </w:r>
-      <w:r>
-        <w:rPr>
-          <w:rtl w:val="0"/>
-        </w:rPr>
-        <w:t xml:space="preserve"/>
       </w:r>
     </w:p>
     <w:p>
@@ -3304,7 +3292,7 @@
       <w:tr>
         <w:trPr>
           <w:cantSplit w:val="0"/>
-          <w:trHeight w:val="1905" w:hRule="atLeast"/>
+          <w:trHeight w:val="405" w:hRule="atLeast"/>
           <w:tblHeader w:val="0"/>
         </w:trPr>
         <w:tc>
@@ -3387,7 +3375,7 @@
               <w:rPr>
                 <w:rtl w:val="0"/>
               </w:rPr>
-              <w:t xml:space="preserve">М. П.</w:t>
+              <w:t xml:space="preserve">{{customerStamp}}</w:t>
             </w:r>
             <w:r>
               <w:rPr>
@@ -3426,7 +3414,7 @@
                 <w:bCs w:val="1"/>
                 <w:rtl w:val="0"/>
               </w:rPr>
-              <w:t xml:space="preserve">{{executorName}}</w:t>
+              <w:t xml:space="preserve">{{executorPosition}}</w:t>
             </w:r>
           </w:p>
           <w:p>
@@ -3463,7 +3451,7 @@
               <w:rPr>
                 <w:rtl w:val="0"/>
               </w:rPr>
-              <w:t xml:space="preserve">{{executorSignature}}</w:t>
+              <w:t xml:space="preserve"> {{executorSignature}}</w:t>
             </w:r>
             <w:r>
               <w:rPr>
@@ -3474,91 +3462,6 @@
         </w:tc>
       </w:tr>
     </w:tbl>
-    <w:p>
-      <w:pPr>
-        <w:widowControl w:val="1"/>
-        <w:spacing w:after="0" w:before="0" w:line="240" w:lineRule="auto"/>
-        <w:jc w:val="right"/>
-        <w:rPr/>
-      </w:pPr>
-      <w:r>
-        <w:rPr>
-          <w:rtl w:val="0"/>
-        </w:rPr>
-      </w:r>
-    </w:p>
-    <w:p>
-      <w:pPr>
-        <w:pBdr>
-          <w:top w:space="0" w:sz="0" w:val="nil"/>
-          <w:left w:space="0" w:sz="0" w:val="nil"/>
-          <w:bottom w:space="0" w:sz="0" w:val="nil"/>
-          <w:right w:space="0" w:sz="0" w:val="nil"/>
-          <w:between w:space="0" w:sz="0" w:val="nil"/>
-        </w:pBdr>
-        <w:spacing w:after="0" w:before="0" w:line="240" w:lineRule="auto"/>
-        <w:rPr/>
-      </w:pPr>
-      <w:r>
-        <w:rPr>
-          <w:rtl w:val="0"/>
-        </w:rPr>
-      </w:r>
-    </w:p>
-    <w:p>
-      <w:pPr>
-        <w:pBdr>
-          <w:top w:space="0" w:sz="0" w:val="nil"/>
-          <w:left w:space="0" w:sz="0" w:val="nil"/>
-          <w:bottom w:space="0" w:sz="0" w:val="nil"/>
-          <w:right w:space="0" w:sz="0" w:val="nil"/>
-          <w:between w:space="0" w:sz="0" w:val="nil"/>
-        </w:pBdr>
-        <w:spacing w:after="0" w:before="0" w:line="240" w:lineRule="auto"/>
-        <w:rPr/>
-      </w:pPr>
-      <w:r>
-        <w:rPr>
-          <w:rtl w:val="0"/>
-        </w:rPr>
-      </w:r>
-    </w:p>
-    <w:p>
-      <w:pPr>
-        <w:pBdr>
-          <w:top w:space="0" w:sz="0" w:val="nil"/>
-          <w:left w:space="0" w:sz="0" w:val="nil"/>
-          <w:bottom w:space="0" w:sz="0" w:val="nil"/>
-          <w:right w:space="0" w:sz="0" w:val="nil"/>
-          <w:between w:space="0" w:sz="0" w:val="nil"/>
-        </w:pBdr>
-        <w:spacing w:after="0" w:before="0" w:line="240" w:lineRule="auto"/>
-        <w:rPr/>
-      </w:pPr>
-      <w:r>
-        <w:rPr>
-          <w:rtl w:val="0"/>
-        </w:rPr>
-      </w:r>
-    </w:p>
-    <w:p>
-      <w:pPr>
-        <w:pBdr>
-          <w:top w:space="0" w:sz="0" w:val="nil"/>
-          <w:left w:space="0" w:sz="0" w:val="nil"/>
-          <w:bottom w:space="0" w:sz="0" w:val="nil"/>
-          <w:right w:space="0" w:sz="0" w:val="nil"/>
-          <w:between w:space="0" w:sz="0" w:val="nil"/>
-        </w:pBdr>
-        <w:spacing w:after="0" w:before="0" w:line="240" w:lineRule="auto"/>
-        <w:rPr/>
-      </w:pPr>
-      <w:r>
-        <w:rPr>
-          <w:rtl w:val="0"/>
-        </w:rPr>
-      </w:r>
-    </w:p>
     <w:p>
       <w:pPr>
         <w:spacing w:after="0" w:before="0" w:line="240" w:lineRule="auto"/>

</xml_diff>